<commit_message>
docs: rebrand question approvals doc to Discovery Quest
Update the generator's cover to "Discovery Quest — Question Approvals /
Missouri History Museum" and regenerate (13 questions across 5 sections).

Co-Authored-By: Claude Opus 4.8 (1M context) <noreply@anthropic.com>
</commit_message>
<xml_diff>
--- a/docs/Question_Approvals.docx
+++ b/docs/Question_Approvals.docx
@@ -13,7 +13,7 @@
           <w:color w:val="1F4E79"/>
           <w:sz w:val="44"/>
         </w:rPr>
-        <w:t>Question Approvals</w:t>
+        <w:t>Discovery Quest — Question Approvals</w:t>
       </w:r>
     </w:p>
     <w:p>
@@ -27,7 +27,7 @@
           <w:color w:val="555555"/>
           <w:sz w:val="26"/>
         </w:rPr>
-        <w:t>Missouri History Museum Scavenger Hunt</w:t>
+        <w:t>Missouri History Museum</w:t>
       </w:r>
     </w:p>
     <w:p>
@@ -40,7 +40,7 @@
           <w:color w:val="555555"/>
           <w:sz w:val="20"/>
         </w:rPr>
-        <w:t>Generated 2026-05-23</w:t>
+        <w:t>Generated 2026-07-02</w:t>
       </w:r>
     </w:p>
     <w:p/>

</xml_diff>

<commit_message>
content: add Route 66 + St. Louis Sound sections, flag now 7:1
Adds the two new sections from Samantha's updated worksheet (Route 66 —
On the Road; St. Louis Sound — Famous Artists), each with youth/teen/adult
variants. With 7 sections and 7 flag covers, the flag mapping becomes a
clean 1:1 (each section restores exactly one region); Forest Park and
Collected drop to a single region each. Regenerated the approvals doc
(15 questions).

Co-Authored-By: Claude Opus 4.8 (1M context) <noreply@anthropic.com>
</commit_message>
<xml_diff>
--- a/docs/Question_Approvals.docx
+++ b/docs/Question_Approvals.docx
@@ -40,7 +40,7 @@
           <w:color w:val="555555"/>
           <w:sz w:val="20"/>
         </w:rPr>
-        <w:t>Generated 2026-07-02</w:t>
+        <w:t>Generated 2026-07-18</w:t>
       </w:r>
     </w:p>
     <w:p/>
@@ -115,6 +115,28 @@
           <w:sz w:val="20"/>
         </w:rPr>
         <w:t>Made in St. Louis  (2 question(s))</w:t>
+      </w:r>
+    </w:p>
+    <w:p>
+      <w:pPr>
+        <w:pStyle w:val="ListBullet"/>
+      </w:pPr>
+      <w:r>
+        <w:rPr>
+          <w:sz w:val="20"/>
+        </w:rPr>
+        <w:t>Route 66  (1 question(s))</w:t>
+      </w:r>
+    </w:p>
+    <w:p>
+      <w:pPr>
+        <w:pStyle w:val="ListBullet"/>
+      </w:pPr>
+      <w:r>
+        <w:rPr>
+          <w:sz w:val="20"/>
+        </w:rPr>
+        <w:t>St. Louis Sound  (1 question(s))</w:t>
       </w:r>
     </w:p>
     <w:p>
@@ -3159,6 +3181,478 @@
         </w:tc>
       </w:tr>
     </w:tbl>
+    <w:p>
+      <w:r>
+        <w:br w:type="page"/>
+      </w:r>
+    </w:p>
+    <w:p>
+      <w:pPr>
+        <w:jc w:val="left"/>
+      </w:pPr>
+      <w:r>
+        <w:rPr>
+          <w:b/>
+          <w:i w:val="0"/>
+          <w:color w:val="1F4E79"/>
+          <w:sz w:val="32"/>
+        </w:rPr>
+        <w:t>Route 66</w:t>
+      </w:r>
+    </w:p>
+    <w:p>
+      <w:r>
+        <w:rPr>
+          <w:i/>
+          <w:color w:val="555555"/>
+          <w:sz w:val="20"/>
+        </w:rPr>
+        <w:t>Get your kicks on the Mother Road.</w:t>
+      </w:r>
+    </w:p>
+    <w:p>
+      <w:r>
+        <w:rPr>
+          <w:color w:val="555555"/>
+          <w:sz w:val="18"/>
+        </w:rPr>
+        <w:t>Patch awarded: Route 66 Patch</w:t>
+      </w:r>
+    </w:p>
+    <w:tbl>
+      <w:tblPr>
+        <w:tblStyle w:val="LightGrid-Accent1"/>
+        <w:tblW w:type="auto" w:w="0"/>
+        <w:tblLayout w:type="fixed"/>
+        <w:tblLook w:firstColumn="1" w:firstRow="1" w:lastColumn="0" w:lastRow="0" w:noHBand="0" w:noVBand="1" w:val="04A0"/>
+      </w:tblPr>
+      <w:tblGrid>
+        <w:gridCol w:w="4320"/>
+        <w:gridCol w:w="4320"/>
+      </w:tblGrid>
+      <w:tr>
+        <w:tc>
+          <w:tcPr>
+            <w:tcW w:type="dxa" w:w="2551"/>
+            <w:shd w:val="clear" w:color="auto" w:fill="EAF1F8"/>
+          </w:tcPr>
+          <w:p>
+            <w:r>
+              <w:rPr>
+                <w:b/>
+              </w:rPr>
+              <w:t>Topic</w:t>
+            </w:r>
+          </w:p>
+        </w:tc>
+        <w:tc>
+          <w:tcPr>
+            <w:tcW w:type="dxa" w:w="6803"/>
+          </w:tcPr>
+          <w:p>
+            <w:r>
+              <w:t>On the Road</w:t>
+            </w:r>
+          </w:p>
+        </w:tc>
+      </w:tr>
+      <w:tr>
+        <w:tc>
+          <w:tcPr>
+            <w:tcW w:type="dxa" w:w="2551"/>
+            <w:shd w:val="clear" w:color="auto" w:fill="EAF1F8"/>
+          </w:tcPr>
+          <w:p>
+            <w:r>
+              <w:rPr>
+                <w:b/>
+              </w:rPr>
+              <w:t>Hint</w:t>
+            </w:r>
+          </w:p>
+        </w:tc>
+        <w:tc>
+          <w:tcPr>
+            <w:tcW w:type="dxa" w:w="6803"/>
+          </w:tcPr>
+          <w:p>
+            <w:r>
+              <w:t>This is where you go to 'get your kicks' — look for the Route 66 logo.</w:t>
+            </w:r>
+          </w:p>
+        </w:tc>
+      </w:tr>
+      <w:tr>
+        <w:tc>
+          <w:tcPr>
+            <w:tcW w:type="dxa" w:w="2551"/>
+            <w:shd w:val="clear" w:color="auto" w:fill="EAF1F8"/>
+          </w:tcPr>
+          <w:p>
+            <w:r>
+              <w:rPr>
+                <w:b/>
+              </w:rPr>
+              <w:t>Youth</w:t>
+            </w:r>
+          </w:p>
+        </w:tc>
+        <w:tc>
+          <w:tcPr>
+            <w:tcW w:type="dxa" w:w="6803"/>
+          </w:tcPr>
+          <w:p>
+            <w:r>
+              <w:t>[multiple choice] What is the name of the iconic ice cream place on Route 66?</w:t>
+              <w:br/>
+              <w:t>Ted Drewes *  ·  Arnold's  ·  McFrosty</w:t>
+            </w:r>
+          </w:p>
+        </w:tc>
+      </w:tr>
+      <w:tr>
+        <w:tc>
+          <w:tcPr>
+            <w:tcW w:type="dxa" w:w="2551"/>
+            <w:shd w:val="clear" w:color="auto" w:fill="EAF1F8"/>
+          </w:tcPr>
+          <w:p>
+            <w:r>
+              <w:rPr>
+                <w:b/>
+              </w:rPr>
+              <w:t>Teen</w:t>
+            </w:r>
+          </w:p>
+        </w:tc>
+        <w:tc>
+          <w:tcPr>
+            <w:tcW w:type="dxa" w:w="6803"/>
+          </w:tcPr>
+          <w:p>
+            <w:r>
+              <w:t>[multiple choice] How many states does Route 66 go through?</w:t>
+              <w:br/>
+              <w:t>5  ·  8 *  ·  7</w:t>
+            </w:r>
+          </w:p>
+        </w:tc>
+      </w:tr>
+      <w:tr>
+        <w:tc>
+          <w:tcPr>
+            <w:tcW w:type="dxa" w:w="2551"/>
+            <w:shd w:val="clear" w:color="auto" w:fill="EAF1F8"/>
+          </w:tcPr>
+          <w:p>
+            <w:r>
+              <w:rPr>
+                <w:b/>
+              </w:rPr>
+              <w:t>Adult</w:t>
+            </w:r>
+          </w:p>
+        </w:tc>
+        <w:tc>
+          <w:tcPr>
+            <w:tcW w:type="dxa" w:w="6803"/>
+          </w:tcPr>
+          <w:p>
+            <w:r>
+              <w:t>[type-in] Who decided to call it "Route 66"?</w:t>
+              <w:br/>
+              <w:t>Answer: Cyrus Avery (also accepted: Avery)</w:t>
+            </w:r>
+          </w:p>
+        </w:tc>
+      </w:tr>
+      <w:tr>
+        <w:tc>
+          <w:tcPr>
+            <w:tcW w:type="dxa" w:w="2551"/>
+            <w:shd w:val="clear" w:color="auto" w:fill="EAF1F8"/>
+          </w:tcPr>
+          <w:p>
+            <w:r>
+              <w:rPr>
+                <w:b/>
+              </w:rPr>
+              <w:t>Approval</w:t>
+            </w:r>
+          </w:p>
+        </w:tc>
+        <w:tc>
+          <w:tcPr>
+            <w:tcW w:type="dxa" w:w="6803"/>
+          </w:tcPr>
+          <w:p>
+            <w:r>
+              <w:t>☐ Approved    ☐ Changes (note below)    ☐ Rejected</w:t>
+            </w:r>
+          </w:p>
+        </w:tc>
+      </w:tr>
+      <w:tr>
+        <w:tc>
+          <w:tcPr>
+            <w:tcW w:type="dxa" w:w="2551"/>
+            <w:shd w:val="clear" w:color="auto" w:fill="EAF1F8"/>
+          </w:tcPr>
+          <w:p>
+            <w:r>
+              <w:rPr>
+                <w:b/>
+              </w:rPr>
+              <w:t>Notes</w:t>
+            </w:r>
+          </w:p>
+        </w:tc>
+        <w:tc>
+          <w:tcPr>
+            <w:tcW w:type="dxa" w:w="6803"/>
+          </w:tcPr>
+          <w:p>
+            <w:r/>
+          </w:p>
+        </w:tc>
+      </w:tr>
+    </w:tbl>
+    <w:p>
+      <w:r>
+        <w:br w:type="page"/>
+      </w:r>
+    </w:p>
+    <w:p>
+      <w:pPr>
+        <w:jc w:val="left"/>
+      </w:pPr>
+      <w:r>
+        <w:rPr>
+          <w:b/>
+          <w:i w:val="0"/>
+          <w:color w:val="1F4E79"/>
+          <w:sz w:val="32"/>
+        </w:rPr>
+        <w:t>St. Louis Sound</w:t>
+      </w:r>
+    </w:p>
+    <w:p>
+      <w:r>
+        <w:rPr>
+          <w:i/>
+          <w:color w:val="555555"/>
+          <w:sz w:val="20"/>
+        </w:rPr>
+        <w:t>The artists who gave St. Louis its sound.</w:t>
+      </w:r>
+    </w:p>
+    <w:p>
+      <w:r>
+        <w:rPr>
+          <w:color w:val="555555"/>
+          <w:sz w:val="18"/>
+        </w:rPr>
+        <w:t>Patch awarded: St. Louis Sound Patch</w:t>
+      </w:r>
+    </w:p>
+    <w:tbl>
+      <w:tblPr>
+        <w:tblStyle w:val="LightGrid-Accent1"/>
+        <w:tblW w:type="auto" w:w="0"/>
+        <w:tblLayout w:type="fixed"/>
+        <w:tblLook w:firstColumn="1" w:firstRow="1" w:lastColumn="0" w:lastRow="0" w:noHBand="0" w:noVBand="1" w:val="04A0"/>
+      </w:tblPr>
+      <w:tblGrid>
+        <w:gridCol w:w="4320"/>
+        <w:gridCol w:w="4320"/>
+      </w:tblGrid>
+      <w:tr>
+        <w:tc>
+          <w:tcPr>
+            <w:tcW w:type="dxa" w:w="2551"/>
+            <w:shd w:val="clear" w:color="auto" w:fill="EAF1F8"/>
+          </w:tcPr>
+          <w:p>
+            <w:r>
+              <w:rPr>
+                <w:b/>
+              </w:rPr>
+              <w:t>Topic</w:t>
+            </w:r>
+          </w:p>
+        </w:tc>
+        <w:tc>
+          <w:tcPr>
+            <w:tcW w:type="dxa" w:w="6803"/>
+          </w:tcPr>
+          <w:p>
+            <w:r>
+              <w:t>Famous Artists</w:t>
+            </w:r>
+          </w:p>
+        </w:tc>
+      </w:tr>
+      <w:tr>
+        <w:tc>
+          <w:tcPr>
+            <w:tcW w:type="dxa" w:w="2551"/>
+            <w:shd w:val="clear" w:color="auto" w:fill="EAF1F8"/>
+          </w:tcPr>
+          <w:p>
+            <w:r>
+              <w:rPr>
+                <w:b/>
+              </w:rPr>
+              <w:t>Hint</w:t>
+            </w:r>
+          </w:p>
+        </w:tc>
+        <w:tc>
+          <w:tcPr>
+            <w:tcW w:type="dxa" w:w="6803"/>
+          </w:tcPr>
+          <w:p>
+            <w:r>
+              <w:t>Do you hear that sound? Look for the St. Louis Sound logo.</w:t>
+            </w:r>
+          </w:p>
+        </w:tc>
+      </w:tr>
+      <w:tr>
+        <w:tc>
+          <w:tcPr>
+            <w:tcW w:type="dxa" w:w="2551"/>
+            <w:shd w:val="clear" w:color="auto" w:fill="EAF1F8"/>
+          </w:tcPr>
+          <w:p>
+            <w:r>
+              <w:rPr>
+                <w:b/>
+              </w:rPr>
+              <w:t>Youth</w:t>
+            </w:r>
+          </w:p>
+        </w:tc>
+        <w:tc>
+          <w:tcPr>
+            <w:tcW w:type="dxa" w:w="6803"/>
+          </w:tcPr>
+          <w:p>
+            <w:r>
+              <w:t>[multiple choice] What instrument did famous jazz musician Miles Davis play?</w:t>
+              <w:br/>
+              <w:t>Trumpet *  ·  Saxophone  ·  Piano</w:t>
+            </w:r>
+          </w:p>
+        </w:tc>
+      </w:tr>
+      <w:tr>
+        <w:tc>
+          <w:tcPr>
+            <w:tcW w:type="dxa" w:w="2551"/>
+            <w:shd w:val="clear" w:color="auto" w:fill="EAF1F8"/>
+          </w:tcPr>
+          <w:p>
+            <w:r>
+              <w:rPr>
+                <w:b/>
+              </w:rPr>
+              <w:t>Teen</w:t>
+            </w:r>
+          </w:p>
+        </w:tc>
+        <w:tc>
+          <w:tcPr>
+            <w:tcW w:type="dxa" w:w="6803"/>
+          </w:tcPr>
+          <w:p>
+            <w:r>
+              <w:t>[multiple choice] Where was the famous dancer, singer, and resistance fighter Josephine Baker born?</w:t>
+              <w:br/>
+              <w:t>Chesterfield  ·  South City  ·  Mill Creek Valley *</w:t>
+            </w:r>
+          </w:p>
+        </w:tc>
+      </w:tr>
+      <w:tr>
+        <w:tc>
+          <w:tcPr>
+            <w:tcW w:type="dxa" w:w="2551"/>
+            <w:shd w:val="clear" w:color="auto" w:fill="EAF1F8"/>
+          </w:tcPr>
+          <w:p>
+            <w:r>
+              <w:rPr>
+                <w:b/>
+              </w:rPr>
+              <w:t>Adult</w:t>
+            </w:r>
+          </w:p>
+        </w:tc>
+        <w:tc>
+          <w:tcPr>
+            <w:tcW w:type="dxa" w:w="6803"/>
+          </w:tcPr>
+          <w:p>
+            <w:r>
+              <w:t>[type-in] Which St. Louis R&amp;B legend was born Anna Mae Bullock?</w:t>
+              <w:br/>
+              <w:t>Answer: Tina Turner (also accepted: Tina)</w:t>
+            </w:r>
+          </w:p>
+        </w:tc>
+      </w:tr>
+      <w:tr>
+        <w:tc>
+          <w:tcPr>
+            <w:tcW w:type="dxa" w:w="2551"/>
+            <w:shd w:val="clear" w:color="auto" w:fill="EAF1F8"/>
+          </w:tcPr>
+          <w:p>
+            <w:r>
+              <w:rPr>
+                <w:b/>
+              </w:rPr>
+              <w:t>Approval</w:t>
+            </w:r>
+          </w:p>
+        </w:tc>
+        <w:tc>
+          <w:tcPr>
+            <w:tcW w:type="dxa" w:w="6803"/>
+          </w:tcPr>
+          <w:p>
+            <w:r>
+              <w:t>☐ Approved    ☐ Changes (note below)    ☐ Rejected</w:t>
+            </w:r>
+          </w:p>
+        </w:tc>
+      </w:tr>
+      <w:tr>
+        <w:tc>
+          <w:tcPr>
+            <w:tcW w:type="dxa" w:w="2551"/>
+            <w:shd w:val="clear" w:color="auto" w:fill="EAF1F8"/>
+          </w:tcPr>
+          <w:p>
+            <w:r>
+              <w:rPr>
+                <w:b/>
+              </w:rPr>
+              <w:t>Notes</w:t>
+            </w:r>
+          </w:p>
+        </w:tc>
+        <w:tc>
+          <w:tcPr>
+            <w:tcW w:type="dxa" w:w="6803"/>
+          </w:tcPr>
+          <w:p>
+            <w:r/>
+          </w:p>
+        </w:tc>
+      </w:tr>
+    </w:tbl>
     <w:sectPr>
       <w:pgSz w:w="12240" w:h="15840"/>
       <w:pgMar w:top="1440" w:right="1800" w:bottom="1440" w:left="1800" w:header="720" w:footer="720" w:gutter="0"/>

</xml_diff>

<commit_message>
content: add STLGameDev section, split flag disc into ring + fleur
Adds the 8th section (STLGameDev — Butterscotch Shenanigans, TJ Hughes,
Graphite Lab, and the aliens) from the studio's worksheet. Splits the
center disc cover into cover-disc-ring (Made in St. Louis) and cover-fleur
(STLGameDev) so all 8 sections map 1:1 to 8 flag regions, with the
fleur-de-lis as the centerpiece finale.

Teen "scan the logo" gets an OCR scan block with the alien question as its
classic fallback; Butterscotch teen also gets an optional logo scan.
Regenerated approvals doc (19 questions).

Co-Authored-By: Claude Opus 4.8 (1M context) <noreply@anthropic.com>
</commit_message>
<xml_diff>
--- a/docs/Question_Approvals.docx
+++ b/docs/Question_Approvals.docx
@@ -140,6 +140,17 @@
       </w:r>
     </w:p>
     <w:p>
+      <w:pPr>
+        <w:pStyle w:val="ListBullet"/>
+      </w:pPr>
+      <w:r>
+        <w:rPr>
+          <w:sz w:val="20"/>
+        </w:rPr>
+        <w:t>STLGameDev  (4 question(s))</w:t>
+      </w:r>
+    </w:p>
+    <w:p>
       <w:r>
         <w:rPr>
           <w:i/>
@@ -3598,6 +3609,891 @@
               <w:t>[type-in] Which St. Louis R&amp;B legend was born Anna Mae Bullock?</w:t>
               <w:br/>
               <w:t>Answer: Tina Turner (also accepted: Tina)</w:t>
+            </w:r>
+          </w:p>
+        </w:tc>
+      </w:tr>
+      <w:tr>
+        <w:tc>
+          <w:tcPr>
+            <w:tcW w:type="dxa" w:w="2551"/>
+            <w:shd w:val="clear" w:color="auto" w:fill="EAF1F8"/>
+          </w:tcPr>
+          <w:p>
+            <w:r>
+              <w:rPr>
+                <w:b/>
+              </w:rPr>
+              <w:t>Approval</w:t>
+            </w:r>
+          </w:p>
+        </w:tc>
+        <w:tc>
+          <w:tcPr>
+            <w:tcW w:type="dxa" w:w="6803"/>
+          </w:tcPr>
+          <w:p>
+            <w:r>
+              <w:t>☐ Approved    ☐ Changes (note below)    ☐ Rejected</w:t>
+            </w:r>
+          </w:p>
+        </w:tc>
+      </w:tr>
+      <w:tr>
+        <w:tc>
+          <w:tcPr>
+            <w:tcW w:type="dxa" w:w="2551"/>
+            <w:shd w:val="clear" w:color="auto" w:fill="EAF1F8"/>
+          </w:tcPr>
+          <w:p>
+            <w:r>
+              <w:rPr>
+                <w:b/>
+              </w:rPr>
+              <w:t>Notes</w:t>
+            </w:r>
+          </w:p>
+        </w:tc>
+        <w:tc>
+          <w:tcPr>
+            <w:tcW w:type="dxa" w:w="6803"/>
+          </w:tcPr>
+          <w:p>
+            <w:r/>
+          </w:p>
+        </w:tc>
+      </w:tr>
+    </w:tbl>
+    <w:p>
+      <w:r>
+        <w:br w:type="page"/>
+      </w:r>
+    </w:p>
+    <w:p>
+      <w:pPr>
+        <w:jc w:val="left"/>
+      </w:pPr>
+      <w:r>
+        <w:rPr>
+          <w:b/>
+          <w:i w:val="0"/>
+          <w:color w:val="1F4E79"/>
+          <w:sz w:val="32"/>
+        </w:rPr>
+        <w:t>STLGameDev</w:t>
+      </w:r>
+    </w:p>
+    <w:p>
+      <w:r>
+        <w:rPr>
+          <w:i/>
+          <w:color w:val="555555"/>
+          <w:sz w:val="20"/>
+        </w:rPr>
+        <w:t>Meet the game studios of St. Louis.</w:t>
+      </w:r>
+    </w:p>
+    <w:p>
+      <w:r>
+        <w:rPr>
+          <w:color w:val="555555"/>
+          <w:sz w:val="18"/>
+        </w:rPr>
+        <w:t>Patch awarded: STLGameDev Patch</w:t>
+      </w:r>
+    </w:p>
+    <w:tbl>
+      <w:tblPr>
+        <w:tblStyle w:val="LightGrid-Accent1"/>
+        <w:tblW w:type="auto" w:w="0"/>
+        <w:tblLayout w:type="fixed"/>
+        <w:tblLook w:firstColumn="1" w:firstRow="1" w:lastColumn="0" w:lastRow="0" w:noHBand="0" w:noVBand="1" w:val="04A0"/>
+      </w:tblPr>
+      <w:tblGrid>
+        <w:gridCol w:w="4320"/>
+        <w:gridCol w:w="4320"/>
+      </w:tblGrid>
+      <w:tr>
+        <w:tc>
+          <w:tcPr>
+            <w:tcW w:type="dxa" w:w="2551"/>
+            <w:shd w:val="clear" w:color="auto" w:fill="EAF1F8"/>
+          </w:tcPr>
+          <w:p>
+            <w:r>
+              <w:rPr>
+                <w:b/>
+              </w:rPr>
+              <w:t>Topic</w:t>
+            </w:r>
+          </w:p>
+        </w:tc>
+        <w:tc>
+          <w:tcPr>
+            <w:tcW w:type="dxa" w:w="6803"/>
+          </w:tcPr>
+          <w:p>
+            <w:r>
+              <w:t>Butterscotch Shenanigans</w:t>
+            </w:r>
+          </w:p>
+        </w:tc>
+      </w:tr>
+      <w:tr>
+        <w:tc>
+          <w:tcPr>
+            <w:tcW w:type="dxa" w:w="2551"/>
+            <w:shd w:val="clear" w:color="auto" w:fill="EAF1F8"/>
+          </w:tcPr>
+          <w:p>
+            <w:r>
+              <w:rPr>
+                <w:b/>
+              </w:rPr>
+              <w:t>Hint</w:t>
+            </w:r>
+          </w:p>
+        </w:tc>
+        <w:tc>
+          <w:tcPr>
+            <w:tcW w:type="dxa" w:w="6803"/>
+          </w:tcPr>
+          <w:p>
+            <w:r>
+              <w:t>In the lower level, look for Butterscotch Shenanigans.</w:t>
+            </w:r>
+          </w:p>
+        </w:tc>
+      </w:tr>
+      <w:tr>
+        <w:tc>
+          <w:tcPr>
+            <w:tcW w:type="dxa" w:w="2551"/>
+            <w:shd w:val="clear" w:color="auto" w:fill="EAF1F8"/>
+          </w:tcPr>
+          <w:p>
+            <w:r>
+              <w:rPr>
+                <w:b/>
+              </w:rPr>
+              <w:t>Youth</w:t>
+            </w:r>
+          </w:p>
+        </w:tc>
+        <w:tc>
+          <w:tcPr>
+            <w:tcW w:type="dxa" w:w="6803"/>
+          </w:tcPr>
+          <w:p>
+            <w:r>
+              <w:t>[multiple choice] How many brothers make up Butterscotch Shenanigans?</w:t>
+              <w:br/>
+              <w:t>1  ·  2  ·  3 *</w:t>
+            </w:r>
+          </w:p>
+        </w:tc>
+      </w:tr>
+      <w:tr>
+        <w:tc>
+          <w:tcPr>
+            <w:tcW w:type="dxa" w:w="2551"/>
+            <w:shd w:val="clear" w:color="auto" w:fill="EAF1F8"/>
+          </w:tcPr>
+          <w:p>
+            <w:r>
+              <w:rPr>
+                <w:b/>
+              </w:rPr>
+              <w:t>Teen</w:t>
+            </w:r>
+          </w:p>
+        </w:tc>
+        <w:tc>
+          <w:tcPr>
+            <w:tcW w:type="dxa" w:w="6803"/>
+          </w:tcPr>
+          <w:p>
+            <w:r>
+              <w:t>[multiple choice] How many brothers make up Butterscotch Shenanigans?</w:t>
+              <w:br/>
+              <w:t>2  ·  3 *  ·  4</w:t>
+            </w:r>
+          </w:p>
+        </w:tc>
+      </w:tr>
+      <w:tr>
+        <w:tc>
+          <w:tcPr>
+            <w:tcW w:type="dxa" w:w="2551"/>
+            <w:shd w:val="clear" w:color="auto" w:fill="EAF1F8"/>
+          </w:tcPr>
+          <w:p>
+            <w:r>
+              <w:rPr>
+                <w:b/>
+              </w:rPr>
+              <w:t xml:space="preserve">  ↳ Camera (optional)</w:t>
+            </w:r>
+          </w:p>
+        </w:tc>
+        <w:tc>
+          <w:tcPr>
+            <w:tcW w:type="dxa" w:w="6803"/>
+          </w:tcPr>
+          <w:p>
+            <w:r>
+              <w:t>Find the Butterscotch Shenanigans logo.  →  Words: Butterscotch, Shenanigans, BUTTERSCOTCH, SHENANIGANS</w:t>
+            </w:r>
+          </w:p>
+        </w:tc>
+      </w:tr>
+      <w:tr>
+        <w:tc>
+          <w:tcPr>
+            <w:tcW w:type="dxa" w:w="2551"/>
+            <w:shd w:val="clear" w:color="auto" w:fill="EAF1F8"/>
+          </w:tcPr>
+          <w:p>
+            <w:r>
+              <w:rPr>
+                <w:b/>
+              </w:rPr>
+              <w:t>Adult</w:t>
+            </w:r>
+          </w:p>
+        </w:tc>
+        <w:tc>
+          <w:tcPr>
+            <w:tcW w:type="dxa" w:w="6803"/>
+          </w:tcPr>
+          <w:p>
+            <w:r>
+              <w:t>[type-in] How many brothers make up Butterscotch Shenanigans?</w:t>
+              <w:br/>
+              <w:t>Answer: 3 (also accepted: three)</w:t>
+            </w:r>
+          </w:p>
+        </w:tc>
+      </w:tr>
+      <w:tr>
+        <w:tc>
+          <w:tcPr>
+            <w:tcW w:type="dxa" w:w="2551"/>
+            <w:shd w:val="clear" w:color="auto" w:fill="EAF1F8"/>
+          </w:tcPr>
+          <w:p>
+            <w:r>
+              <w:rPr>
+                <w:b/>
+              </w:rPr>
+              <w:t>Approval</w:t>
+            </w:r>
+          </w:p>
+        </w:tc>
+        <w:tc>
+          <w:tcPr>
+            <w:tcW w:type="dxa" w:w="6803"/>
+          </w:tcPr>
+          <w:p>
+            <w:r>
+              <w:t>☐ Approved    ☐ Changes (note below)    ☐ Rejected</w:t>
+            </w:r>
+          </w:p>
+        </w:tc>
+      </w:tr>
+      <w:tr>
+        <w:tc>
+          <w:tcPr>
+            <w:tcW w:type="dxa" w:w="2551"/>
+            <w:shd w:val="clear" w:color="auto" w:fill="EAF1F8"/>
+          </w:tcPr>
+          <w:p>
+            <w:r>
+              <w:rPr>
+                <w:b/>
+              </w:rPr>
+              <w:t>Notes</w:t>
+            </w:r>
+          </w:p>
+        </w:tc>
+        <w:tc>
+          <w:tcPr>
+            <w:tcW w:type="dxa" w:w="6803"/>
+          </w:tcPr>
+          <w:p>
+            <w:r/>
+          </w:p>
+        </w:tc>
+      </w:tr>
+    </w:tbl>
+    <w:p/>
+    <w:tbl>
+      <w:tblPr>
+        <w:tblStyle w:val="LightGrid-Accent1"/>
+        <w:tblW w:type="auto" w:w="0"/>
+        <w:tblLayout w:type="fixed"/>
+        <w:tblLook w:firstColumn="1" w:firstRow="1" w:lastColumn="0" w:lastRow="0" w:noHBand="0" w:noVBand="1" w:val="04A0"/>
+      </w:tblPr>
+      <w:tblGrid>
+        <w:gridCol w:w="4320"/>
+        <w:gridCol w:w="4320"/>
+      </w:tblGrid>
+      <w:tr>
+        <w:tc>
+          <w:tcPr>
+            <w:tcW w:type="dxa" w:w="2551"/>
+            <w:shd w:val="clear" w:color="auto" w:fill="EAF1F8"/>
+          </w:tcPr>
+          <w:p>
+            <w:r>
+              <w:rPr>
+                <w:b/>
+              </w:rPr>
+              <w:t>Topic</w:t>
+            </w:r>
+          </w:p>
+        </w:tc>
+        <w:tc>
+          <w:tcPr>
+            <w:tcW w:type="dxa" w:w="6803"/>
+          </w:tcPr>
+          <w:p>
+            <w:r>
+              <w:t>TJ Hughes</w:t>
+            </w:r>
+          </w:p>
+        </w:tc>
+      </w:tr>
+      <w:tr>
+        <w:tc>
+          <w:tcPr>
+            <w:tcW w:type="dxa" w:w="2551"/>
+            <w:shd w:val="clear" w:color="auto" w:fill="EAF1F8"/>
+          </w:tcPr>
+          <w:p>
+            <w:r>
+              <w:rPr>
+                <w:b/>
+              </w:rPr>
+              <w:t>Hint</w:t>
+            </w:r>
+          </w:p>
+        </w:tc>
+        <w:tc>
+          <w:tcPr>
+            <w:tcW w:type="dxa" w:w="6803"/>
+          </w:tcPr>
+          <w:p>
+            <w:r>
+              <w:t>In the lower level, look for TJ Hughes!</w:t>
+            </w:r>
+          </w:p>
+        </w:tc>
+      </w:tr>
+      <w:tr>
+        <w:tc>
+          <w:tcPr>
+            <w:tcW w:type="dxa" w:w="2551"/>
+            <w:shd w:val="clear" w:color="auto" w:fill="EAF1F8"/>
+          </w:tcPr>
+          <w:p>
+            <w:r>
+              <w:rPr>
+                <w:b/>
+              </w:rPr>
+              <w:t>Youth</w:t>
+            </w:r>
+          </w:p>
+        </w:tc>
+        <w:tc>
+          <w:tcPr>
+            <w:tcW w:type="dxa" w:w="6803"/>
+          </w:tcPr>
+          <w:p>
+            <w:r>
+              <w:t>[multiple choice] TJ Hughes created a game that plays with what?</w:t>
+              <w:br/>
+              <w:t>Cars  ·  People  ·  Food *</w:t>
+            </w:r>
+          </w:p>
+        </w:tc>
+      </w:tr>
+      <w:tr>
+        <w:tc>
+          <w:tcPr>
+            <w:tcW w:type="dxa" w:w="2551"/>
+            <w:shd w:val="clear" w:color="auto" w:fill="EAF1F8"/>
+          </w:tcPr>
+          <w:p>
+            <w:r>
+              <w:rPr>
+                <w:b/>
+              </w:rPr>
+              <w:t>Teen</w:t>
+            </w:r>
+          </w:p>
+        </w:tc>
+        <w:tc>
+          <w:tcPr>
+            <w:tcW w:type="dxa" w:w="6803"/>
+          </w:tcPr>
+          <w:p>
+            <w:r>
+              <w:t>[multiple choice] What is the name of TJ Hughes' game?</w:t>
+              <w:br/>
+              <w:t>Nour *  ·  Noodleman  ·  Ice Cream Blitz</w:t>
+            </w:r>
+          </w:p>
+        </w:tc>
+      </w:tr>
+      <w:tr>
+        <w:tc>
+          <w:tcPr>
+            <w:tcW w:type="dxa" w:w="2551"/>
+            <w:shd w:val="clear" w:color="auto" w:fill="EAF1F8"/>
+          </w:tcPr>
+          <w:p>
+            <w:r>
+              <w:rPr>
+                <w:b/>
+              </w:rPr>
+              <w:t>Adult</w:t>
+            </w:r>
+          </w:p>
+        </w:tc>
+        <w:tc>
+          <w:tcPr>
+            <w:tcW w:type="dxa" w:w="6803"/>
+          </w:tcPr>
+          <w:p>
+            <w:r>
+              <w:t>[type-in] What is the name of TJ Hughes' game?</w:t>
+              <w:br/>
+              <w:t>Answer: Nour</w:t>
+            </w:r>
+          </w:p>
+        </w:tc>
+      </w:tr>
+      <w:tr>
+        <w:tc>
+          <w:tcPr>
+            <w:tcW w:type="dxa" w:w="2551"/>
+            <w:shd w:val="clear" w:color="auto" w:fill="EAF1F8"/>
+          </w:tcPr>
+          <w:p>
+            <w:r>
+              <w:rPr>
+                <w:b/>
+              </w:rPr>
+              <w:t>Approval</w:t>
+            </w:r>
+          </w:p>
+        </w:tc>
+        <w:tc>
+          <w:tcPr>
+            <w:tcW w:type="dxa" w:w="6803"/>
+          </w:tcPr>
+          <w:p>
+            <w:r>
+              <w:t>☐ Approved    ☐ Changes (note below)    ☐ Rejected</w:t>
+            </w:r>
+          </w:p>
+        </w:tc>
+      </w:tr>
+      <w:tr>
+        <w:tc>
+          <w:tcPr>
+            <w:tcW w:type="dxa" w:w="2551"/>
+            <w:shd w:val="clear" w:color="auto" w:fill="EAF1F8"/>
+          </w:tcPr>
+          <w:p>
+            <w:r>
+              <w:rPr>
+                <w:b/>
+              </w:rPr>
+              <w:t>Notes</w:t>
+            </w:r>
+          </w:p>
+        </w:tc>
+        <w:tc>
+          <w:tcPr>
+            <w:tcW w:type="dxa" w:w="6803"/>
+          </w:tcPr>
+          <w:p>
+            <w:r/>
+          </w:p>
+        </w:tc>
+      </w:tr>
+    </w:tbl>
+    <w:p/>
+    <w:tbl>
+      <w:tblPr>
+        <w:tblStyle w:val="LightGrid-Accent1"/>
+        <w:tblW w:type="auto" w:w="0"/>
+        <w:tblLayout w:type="fixed"/>
+        <w:tblLook w:firstColumn="1" w:firstRow="1" w:lastColumn="0" w:lastRow="0" w:noHBand="0" w:noVBand="1" w:val="04A0"/>
+      </w:tblPr>
+      <w:tblGrid>
+        <w:gridCol w:w="4320"/>
+        <w:gridCol w:w="4320"/>
+      </w:tblGrid>
+      <w:tr>
+        <w:tc>
+          <w:tcPr>
+            <w:tcW w:type="dxa" w:w="2551"/>
+            <w:shd w:val="clear" w:color="auto" w:fill="EAF1F8"/>
+          </w:tcPr>
+          <w:p>
+            <w:r>
+              <w:rPr>
+                <w:b/>
+              </w:rPr>
+              <w:t>Topic</w:t>
+            </w:r>
+          </w:p>
+        </w:tc>
+        <w:tc>
+          <w:tcPr>
+            <w:tcW w:type="dxa" w:w="6803"/>
+          </w:tcPr>
+          <w:p>
+            <w:r>
+              <w:t>Graphite Lab</w:t>
+            </w:r>
+          </w:p>
+        </w:tc>
+      </w:tr>
+      <w:tr>
+        <w:tc>
+          <w:tcPr>
+            <w:tcW w:type="dxa" w:w="2551"/>
+            <w:shd w:val="clear" w:color="auto" w:fill="EAF1F8"/>
+          </w:tcPr>
+          <w:p>
+            <w:r>
+              <w:rPr>
+                <w:b/>
+              </w:rPr>
+              <w:t>Hint</w:t>
+            </w:r>
+          </w:p>
+        </w:tc>
+        <w:tc>
+          <w:tcPr>
+            <w:tcW w:type="dxa" w:w="6803"/>
+          </w:tcPr>
+          <w:p>
+            <w:r>
+              <w:t>In the lower level, look for Graphite Lab!</w:t>
+            </w:r>
+          </w:p>
+        </w:tc>
+      </w:tr>
+      <w:tr>
+        <w:tc>
+          <w:tcPr>
+            <w:tcW w:type="dxa" w:w="2551"/>
+            <w:shd w:val="clear" w:color="auto" w:fill="EAF1F8"/>
+          </w:tcPr>
+          <w:p>
+            <w:r>
+              <w:rPr>
+                <w:b/>
+              </w:rPr>
+              <w:t>Youth</w:t>
+            </w:r>
+          </w:p>
+        </w:tc>
+        <w:tc>
+          <w:tcPr>
+            <w:tcW w:type="dxa" w:w="6803"/>
+          </w:tcPr>
+          <w:p>
+            <w:r>
+              <w:t>[multiple choice] Graphite Lab created a game where you serve food called what?</w:t>
+              <w:br/>
+              <w:t>Chop Chop *  ·  Push Push  ·  Sit Sit</w:t>
+            </w:r>
+          </w:p>
+        </w:tc>
+      </w:tr>
+      <w:tr>
+        <w:tc>
+          <w:tcPr>
+            <w:tcW w:type="dxa" w:w="2551"/>
+            <w:shd w:val="clear" w:color="auto" w:fill="EAF1F8"/>
+          </w:tcPr>
+          <w:p>
+            <w:r>
+              <w:rPr>
+                <w:b/>
+              </w:rPr>
+              <w:t>Teen</w:t>
+            </w:r>
+          </w:p>
+        </w:tc>
+        <w:tc>
+          <w:tcPr>
+            <w:tcW w:type="dxa" w:w="6803"/>
+          </w:tcPr>
+          <w:p>
+            <w:r>
+              <w:t>[multiple choice] How many games has Graphite Lab developed?</w:t>
+              <w:br/>
+              <w:t>5  ·  200 *  ·  1000</w:t>
+            </w:r>
+          </w:p>
+        </w:tc>
+      </w:tr>
+      <w:tr>
+        <w:tc>
+          <w:tcPr>
+            <w:tcW w:type="dxa" w:w="2551"/>
+            <w:shd w:val="clear" w:color="auto" w:fill="EAF1F8"/>
+          </w:tcPr>
+          <w:p>
+            <w:r>
+              <w:rPr>
+                <w:b/>
+              </w:rPr>
+              <w:t>Adult</w:t>
+            </w:r>
+          </w:p>
+        </w:tc>
+        <w:tc>
+          <w:tcPr>
+            <w:tcW w:type="dxa" w:w="6803"/>
+          </w:tcPr>
+          <w:p>
+            <w:r>
+              <w:t>[type-in] Graphite Lab has created games for what major publisher?</w:t>
+              <w:br/>
+              <w:t>Answer: Atari</w:t>
+            </w:r>
+          </w:p>
+        </w:tc>
+      </w:tr>
+      <w:tr>
+        <w:tc>
+          <w:tcPr>
+            <w:tcW w:type="dxa" w:w="2551"/>
+            <w:shd w:val="clear" w:color="auto" w:fill="EAF1F8"/>
+          </w:tcPr>
+          <w:p>
+            <w:r>
+              <w:rPr>
+                <w:b/>
+              </w:rPr>
+              <w:t>Approval</w:t>
+            </w:r>
+          </w:p>
+        </w:tc>
+        <w:tc>
+          <w:tcPr>
+            <w:tcW w:type="dxa" w:w="6803"/>
+          </w:tcPr>
+          <w:p>
+            <w:r>
+              <w:t>☐ Approved    ☐ Changes (note below)    ☐ Rejected</w:t>
+            </w:r>
+          </w:p>
+        </w:tc>
+      </w:tr>
+      <w:tr>
+        <w:tc>
+          <w:tcPr>
+            <w:tcW w:type="dxa" w:w="2551"/>
+            <w:shd w:val="clear" w:color="auto" w:fill="EAF1F8"/>
+          </w:tcPr>
+          <w:p>
+            <w:r>
+              <w:rPr>
+                <w:b/>
+              </w:rPr>
+              <w:t>Notes</w:t>
+            </w:r>
+          </w:p>
+        </w:tc>
+        <w:tc>
+          <w:tcPr>
+            <w:tcW w:type="dxa" w:w="6803"/>
+          </w:tcPr>
+          <w:p>
+            <w:r/>
+          </w:p>
+        </w:tc>
+      </w:tr>
+    </w:tbl>
+    <w:p/>
+    <w:tbl>
+      <w:tblPr>
+        <w:tblStyle w:val="LightGrid-Accent1"/>
+        <w:tblW w:type="auto" w:w="0"/>
+        <w:tblLayout w:type="fixed"/>
+        <w:tblLook w:firstColumn="1" w:firstRow="1" w:lastColumn="0" w:lastRow="0" w:noHBand="0" w:noVBand="1" w:val="04A0"/>
+      </w:tblPr>
+      <w:tblGrid>
+        <w:gridCol w:w="4320"/>
+        <w:gridCol w:w="4320"/>
+      </w:tblGrid>
+      <w:tr>
+        <w:tc>
+          <w:tcPr>
+            <w:tcW w:type="dxa" w:w="2551"/>
+            <w:shd w:val="clear" w:color="auto" w:fill="EAF1F8"/>
+          </w:tcPr>
+          <w:p>
+            <w:r>
+              <w:rPr>
+                <w:b/>
+              </w:rPr>
+              <w:t>Topic</w:t>
+            </w:r>
+          </w:p>
+        </w:tc>
+        <w:tc>
+          <w:tcPr>
+            <w:tcW w:type="dxa" w:w="6803"/>
+          </w:tcPr>
+          <w:p>
+            <w:r>
+              <w:t>STLGameDev</w:t>
+            </w:r>
+          </w:p>
+        </w:tc>
+      </w:tr>
+      <w:tr>
+        <w:tc>
+          <w:tcPr>
+            <w:tcW w:type="dxa" w:w="2551"/>
+            <w:shd w:val="clear" w:color="auto" w:fill="EAF1F8"/>
+          </w:tcPr>
+          <w:p>
+            <w:r>
+              <w:rPr>
+                <w:b/>
+              </w:rPr>
+              <w:t>Hint</w:t>
+            </w:r>
+          </w:p>
+        </w:tc>
+        <w:tc>
+          <w:tcPr>
+            <w:tcW w:type="dxa" w:w="6803"/>
+          </w:tcPr>
+          <w:p>
+            <w:r>
+              <w:t>In the lower level, look for the little aliens!</w:t>
+            </w:r>
+          </w:p>
+        </w:tc>
+      </w:tr>
+      <w:tr>
+        <w:tc>
+          <w:tcPr>
+            <w:tcW w:type="dxa" w:w="2551"/>
+            <w:shd w:val="clear" w:color="auto" w:fill="EAF1F8"/>
+          </w:tcPr>
+          <w:p>
+            <w:r>
+              <w:rPr>
+                <w:b/>
+              </w:rPr>
+              <w:t>Youth</w:t>
+            </w:r>
+          </w:p>
+        </w:tc>
+        <w:tc>
+          <w:tcPr>
+            <w:tcW w:type="dxa" w:w="6803"/>
+          </w:tcPr>
+          <w:p>
+            <w:r>
+              <w:t>[multiple choice] What is the name of STLGameDev's purple alien?</w:t>
+              <w:br/>
+              <w:t>Zeepo  ·  Grunkle  ·  Plorp *</w:t>
+            </w:r>
+          </w:p>
+        </w:tc>
+      </w:tr>
+      <w:tr>
+        <w:tc>
+          <w:tcPr>
+            <w:tcW w:type="dxa" w:w="2551"/>
+            <w:shd w:val="clear" w:color="auto" w:fill="EAF1F8"/>
+          </w:tcPr>
+          <w:p>
+            <w:r>
+              <w:rPr>
+                <w:b/>
+              </w:rPr>
+              <w:t>Teen</w:t>
+            </w:r>
+          </w:p>
+        </w:tc>
+        <w:tc>
+          <w:tcPr>
+            <w:tcW w:type="dxa" w:w="6803"/>
+          </w:tcPr>
+          <w:p>
+            <w:r>
+              <w:t>[multiple choice] What is the name of STLGameDev's purple alien?</w:t>
+              <w:br/>
+              <w:t>Zeepo  ·  Grunkle  ·  Plorp *</w:t>
+            </w:r>
+          </w:p>
+        </w:tc>
+      </w:tr>
+      <w:tr>
+        <w:tc>
+          <w:tcPr>
+            <w:tcW w:type="dxa" w:w="2551"/>
+            <w:shd w:val="clear" w:color="auto" w:fill="EAF1F8"/>
+          </w:tcPr>
+          <w:p>
+            <w:r>
+              <w:rPr>
+                <w:b/>
+              </w:rPr>
+              <w:t xml:space="preserve">  ↳ Camera (optional)</w:t>
+            </w:r>
+          </w:p>
+        </w:tc>
+        <w:tc>
+          <w:tcPr>
+            <w:tcW w:type="dxa" w:w="6803"/>
+          </w:tcPr>
+          <w:p>
+            <w:r>
+              <w:t>Scan the STLGameDev logo!  →  Words: GAMEDEV, GAME DEV, STLGAMEDEV, STL</w:t>
+            </w:r>
+          </w:p>
+        </w:tc>
+      </w:tr>
+      <w:tr>
+        <w:tc>
+          <w:tcPr>
+            <w:tcW w:type="dxa" w:w="2551"/>
+            <w:shd w:val="clear" w:color="auto" w:fill="EAF1F8"/>
+          </w:tcPr>
+          <w:p>
+            <w:r>
+              <w:rPr>
+                <w:b/>
+              </w:rPr>
+              <w:t>Adult</w:t>
+            </w:r>
+          </w:p>
+        </w:tc>
+        <w:tc>
+          <w:tcPr>
+            <w:tcW w:type="dxa" w:w="6803"/>
+          </w:tcPr>
+          <w:p>
+            <w:r>
+              <w:t>[type-in] What is the name of STLGameDev's purple alien?</w:t>
+              <w:br/>
+              <w:t>Answer: Plorp</w:t>
             </w:r>
           </w:p>
         </w:tc>

</xml_diff>

<commit_message>
content: re-sync questions to Samantha worksheet (2)
Reconcile the non-STLGameDev sections to the updated worksheet + target
counts:
- World's Fair: drop Parlor Queen (not in worksheet) -> 3
- Collected: drop Anna/wolf (now example-only), update Intaglio youth to
  the Goetsch/"Art" question -> 3
- Forest Park: add "What is Forest Park" (Play / Hudlin 1945 / 23 statues) -> 3
- Made in St. Louis: drop Build-A-Bear (marked "take out") -> 1
- Marvel in Motion / Route 66 / St. Louis Sound unchanged (1 each)
- STLGameDev untouched (4)

Removed orphaned hint images (parlor-queen.png, wolf-hint.svg). Flag
mapping unchanged (still 8 sections). Regenerated approvals doc (17 Qs).

Co-Authored-By: Claude Opus 4.8 (1M context) <noreply@anthropic.com>
</commit_message>
<xml_diff>
--- a/docs/Question_Approvals.docx
+++ b/docs/Question_Approvals.docx
@@ -40,7 +40,7 @@
           <w:color w:val="555555"/>
           <w:sz w:val="20"/>
         </w:rPr>
-        <w:t>Generated 2026-07-18</w:t>
+        <w:t>Generated 2026-07-20</w:t>
       </w:r>
     </w:p>
     <w:p/>
@@ -70,7 +70,7 @@
         <w:rPr>
           <w:sz w:val="20"/>
         </w:rPr>
-        <w:t>World's Fair  (4 question(s))</w:t>
+        <w:t>World's Fair  (3 question(s))</w:t>
       </w:r>
     </w:p>
     <w:p>
@@ -92,7 +92,7 @@
         <w:rPr>
           <w:sz w:val="20"/>
         </w:rPr>
-        <w:t>Yours Forever, Forest Park at 150  (2 question(s))</w:t>
+        <w:t>Yours Forever, Forest Park at 150  (3 question(s))</w:t>
       </w:r>
     </w:p>
     <w:p>
@@ -103,7 +103,7 @@
         <w:rPr>
           <w:sz w:val="20"/>
         </w:rPr>
-        <w:t>Collected  (4 question(s))</w:t>
+        <w:t>Collected  (3 question(s))</w:t>
       </w:r>
     </w:p>
     <w:p>
@@ -114,7 +114,7 @@
         <w:rPr>
           <w:sz w:val="20"/>
         </w:rPr>
-        <w:t>Made in St. Louis  (2 question(s))</w:t>
+        <w:t>Made in St. Louis  (1 question(s))</w:t>
       </w:r>
     </w:p>
     <w:p>
@@ -198,283 +198,6 @@
         <w:t>Patch awarded: World's Fair Patch</w:t>
       </w:r>
     </w:p>
-    <w:tbl>
-      <w:tblPr>
-        <w:tblStyle w:val="LightGrid-Accent1"/>
-        <w:tblW w:type="auto" w:w="0"/>
-        <w:tblLayout w:type="fixed"/>
-        <w:tblLook w:firstColumn="1" w:firstRow="1" w:lastColumn="0" w:lastRow="0" w:noHBand="0" w:noVBand="1" w:val="04A0"/>
-      </w:tblPr>
-      <w:tblGrid>
-        <w:gridCol w:w="4320"/>
-        <w:gridCol w:w="4320"/>
-      </w:tblGrid>
-      <w:tr>
-        <w:tc>
-          <w:tcPr>
-            <w:tcW w:type="dxa" w:w="2551"/>
-            <w:shd w:val="clear" w:color="auto" w:fill="EAF1F8"/>
-          </w:tcPr>
-          <w:p>
-            <w:r>
-              <w:rPr>
-                <w:b/>
-              </w:rPr>
-              <w:t>Topic</w:t>
-            </w:r>
-          </w:p>
-        </w:tc>
-        <w:tc>
-          <w:tcPr>
-            <w:tcW w:type="dxa" w:w="6803"/>
-          </w:tcPr>
-          <w:p>
-            <w:r>
-              <w:t>Parlor Queen</w:t>
-            </w:r>
-          </w:p>
-        </w:tc>
-      </w:tr>
-      <w:tr>
-        <w:tc>
-          <w:tcPr>
-            <w:tcW w:type="dxa" w:w="2551"/>
-            <w:shd w:val="clear" w:color="auto" w:fill="EAF1F8"/>
-          </w:tcPr>
-          <w:p>
-            <w:r>
-              <w:rPr>
-                <w:b/>
-              </w:rPr>
-              <w:t>Hint</w:t>
-            </w:r>
-          </w:p>
-        </w:tc>
-        <w:tc>
-          <w:tcPr>
-            <w:tcW w:type="dxa" w:w="6803"/>
-          </w:tcPr>
-          <w:p>
-            <w:r>
-              <w:t>Look for the long broom-like object in the World's Fair hall.</w:t>
-            </w:r>
-          </w:p>
-        </w:tc>
-      </w:tr>
-      <w:tr>
-        <w:tc>
-          <w:tcPr>
-            <w:tcW w:type="dxa" w:w="2551"/>
-            <w:shd w:val="clear" w:color="auto" w:fill="EAF1F8"/>
-          </w:tcPr>
-          <w:p>
-            <w:r>
-              <w:rPr>
-                <w:b/>
-              </w:rPr>
-              <w:t>Hint image</w:t>
-            </w:r>
-          </w:p>
-        </w:tc>
-        <w:tc>
-          <w:tcPr>
-            <w:tcW w:type="dxa" w:w="6803"/>
-          </w:tcPr>
-          <w:p>
-            <w:r>
-              <w:t>images/parlor-queen.png</w:t>
-            </w:r>
-          </w:p>
-        </w:tc>
-      </w:tr>
-      <w:tr>
-        <w:tc>
-          <w:tcPr>
-            <w:tcW w:type="dxa" w:w="2551"/>
-            <w:shd w:val="clear" w:color="auto" w:fill="EAF1F8"/>
-          </w:tcPr>
-          <w:p>
-            <w:r>
-              <w:rPr>
-                <w:b/>
-              </w:rPr>
-              <w:t>Youth</w:t>
-            </w:r>
-          </w:p>
-        </w:tc>
-        <w:tc>
-          <w:tcPr>
-            <w:tcW w:type="dxa" w:w="6803"/>
-          </w:tcPr>
-          <w:p>
-            <w:r>
-              <w:t>[multiple choice] What was the name of the floor sweeping invention showcased at the fair?</w:t>
-              <w:br/>
-              <w:t>Parlor Queen *  ·  Floor Buddy  ·  Sweeping Sally</w:t>
-            </w:r>
-          </w:p>
-        </w:tc>
-      </w:tr>
-      <w:tr>
-        <w:tc>
-          <w:tcPr>
-            <w:tcW w:type="dxa" w:w="2551"/>
-            <w:shd w:val="clear" w:color="auto" w:fill="EAF1F8"/>
-          </w:tcPr>
-          <w:p>
-            <w:r>
-              <w:rPr>
-                <w:b/>
-              </w:rPr>
-              <w:t>Teen</w:t>
-            </w:r>
-          </w:p>
-        </w:tc>
-        <w:tc>
-          <w:tcPr>
-            <w:tcW w:type="dxa" w:w="6803"/>
-          </w:tcPr>
-          <w:p>
-            <w:r>
-              <w:t>[multiple choice] What is the Parlor Queen used for?</w:t>
-              <w:br/>
-              <w:t>Sweeping floors *  ·  Organizing pantries  ·  Washing dishes</w:t>
-            </w:r>
-          </w:p>
-        </w:tc>
-      </w:tr>
-      <w:tr>
-        <w:tc>
-          <w:tcPr>
-            <w:tcW w:type="dxa" w:w="2551"/>
-            <w:shd w:val="clear" w:color="auto" w:fill="EAF1F8"/>
-          </w:tcPr>
-          <w:p>
-            <w:r>
-              <w:rPr>
-                <w:b/>
-              </w:rPr>
-              <w:t xml:space="preserve">  ↳ Camera (optional)</w:t>
-            </w:r>
-          </w:p>
-        </w:tc>
-        <w:tc>
-          <w:tcPr>
-            <w:tcW w:type="dxa" w:w="6803"/>
-          </w:tcPr>
-          <w:p>
-            <w:r>
-              <w:t>Find a plaque that mentions the words "parlor queen".  →  Words: parlor queen, Parlor Queen</w:t>
-            </w:r>
-          </w:p>
-        </w:tc>
-      </w:tr>
-      <w:tr>
-        <w:tc>
-          <w:tcPr>
-            <w:tcW w:type="dxa" w:w="2551"/>
-            <w:shd w:val="clear" w:color="auto" w:fill="EAF1F8"/>
-          </w:tcPr>
-          <w:p>
-            <w:r>
-              <w:rPr>
-                <w:b/>
-              </w:rPr>
-              <w:t>Adult</w:t>
-            </w:r>
-          </w:p>
-        </w:tc>
-        <w:tc>
-          <w:tcPr>
-            <w:tcW w:type="dxa" w:w="6803"/>
-          </w:tcPr>
-          <w:p>
-            <w:r>
-              <w:t>[type-in] What company created the Parlor Queen?</w:t>
-              <w:br/>
-              <w:t>Answer: Bissell (also accepted: The Bissell Company, Bissell Company, Bissell's)</w:t>
-            </w:r>
-          </w:p>
-        </w:tc>
-      </w:tr>
-      <w:tr>
-        <w:tc>
-          <w:tcPr>
-            <w:tcW w:type="dxa" w:w="2551"/>
-            <w:shd w:val="clear" w:color="auto" w:fill="EAF1F8"/>
-          </w:tcPr>
-          <w:p>
-            <w:r>
-              <w:rPr>
-                <w:b/>
-              </w:rPr>
-              <w:t xml:space="preserve">  ↳ Camera (optional)</w:t>
-            </w:r>
-          </w:p>
-        </w:tc>
-        <w:tc>
-          <w:tcPr>
-            <w:tcW w:type="dxa" w:w="6803"/>
-          </w:tcPr>
-          <w:p>
-            <w:r>
-              <w:t>Find the company that created the Parlor Queen on a plaque.  →  Words: Bissell</w:t>
-            </w:r>
-          </w:p>
-        </w:tc>
-      </w:tr>
-      <w:tr>
-        <w:tc>
-          <w:tcPr>
-            <w:tcW w:type="dxa" w:w="2551"/>
-            <w:shd w:val="clear" w:color="auto" w:fill="EAF1F8"/>
-          </w:tcPr>
-          <w:p>
-            <w:r>
-              <w:rPr>
-                <w:b/>
-              </w:rPr>
-              <w:t>Approval</w:t>
-            </w:r>
-          </w:p>
-        </w:tc>
-        <w:tc>
-          <w:tcPr>
-            <w:tcW w:type="dxa" w:w="6803"/>
-          </w:tcPr>
-          <w:p>
-            <w:r>
-              <w:t>☐ Approved    ☐ Changes (note below)    ☐ Rejected</w:t>
-            </w:r>
-          </w:p>
-        </w:tc>
-      </w:tr>
-      <w:tr>
-        <w:tc>
-          <w:tcPr>
-            <w:tcW w:type="dxa" w:w="2551"/>
-            <w:shd w:val="clear" w:color="auto" w:fill="EAF1F8"/>
-          </w:tcPr>
-          <w:p>
-            <w:r>
-              <w:rPr>
-                <w:b/>
-              </w:rPr>
-              <w:t>Notes</w:t>
-            </w:r>
-          </w:p>
-        </w:tc>
-        <w:tc>
-          <w:tcPr>
-            <w:tcW w:type="dxa" w:w="6803"/>
-          </w:tcPr>
-          <w:p>
-            <w:r/>
-          </w:p>
-        </w:tc>
-      </w:tr>
-    </w:tbl>
-    <w:p/>
     <w:tbl>
       <w:tblPr>
         <w:tblStyle w:val="LightGrid-Accent1"/>
@@ -1820,44 +1543,7 @@
         </w:tc>
       </w:tr>
     </w:tbl>
-    <w:p>
-      <w:r>
-        <w:br w:type="page"/>
-      </w:r>
-    </w:p>
-    <w:p>
-      <w:pPr>
-        <w:jc w:val="left"/>
-      </w:pPr>
-      <w:r>
-        <w:rPr>
-          <w:b/>
-          <w:i w:val="0"/>
-          <w:color w:val="1F4E79"/>
-          <w:sz w:val="32"/>
-        </w:rPr>
-        <w:t>Collected</w:t>
-      </w:r>
-    </w:p>
-    <w:p>
-      <w:r>
-        <w:rPr>
-          <w:i/>
-          <w:color w:val="555555"/>
-          <w:sz w:val="20"/>
-        </w:rPr>
-        <w:t>Stories behind objects in the Collected gallery.</w:t>
-      </w:r>
-    </w:p>
-    <w:p>
-      <w:r>
-        <w:rPr>
-          <w:color w:val="555555"/>
-          <w:sz w:val="18"/>
-        </w:rPr>
-        <w:t>Patch awarded: Collected Patch</w:t>
-      </w:r>
-    </w:p>
+    <w:p/>
     <w:tbl>
       <w:tblPr>
         <w:tblStyle w:val="LightGrid-Accent1"/>
@@ -1890,7 +1576,7 @@
           </w:tcPr>
           <w:p>
             <w:r>
-              <w:t>Anna — Mexican Grey Wolf</w:t>
+              <w:t>What is Forest Park</w:t>
             </w:r>
           </w:p>
         </w:tc>
@@ -1916,33 +1602,7 @@
           </w:tcPr>
           <w:p>
             <w:r>
-              <w:t>Look for the wolf display in the Collected gallery.</w:t>
-            </w:r>
-          </w:p>
-        </w:tc>
-      </w:tr>
-      <w:tr>
-        <w:tc>
-          <w:tcPr>
-            <w:tcW w:type="dxa" w:w="2551"/>
-            <w:shd w:val="clear" w:color="auto" w:fill="EAF1F8"/>
-          </w:tcPr>
-          <w:p>
-            <w:r>
-              <w:rPr>
-                <w:b/>
-              </w:rPr>
-              <w:t>Hint image</w:t>
-            </w:r>
-          </w:p>
-        </w:tc>
-        <w:tc>
-          <w:tcPr>
-            <w:tcW w:type="dxa" w:w="6803"/>
-          </w:tcPr>
-          <w:p>
-            <w:r>
-              <w:t>images/wolf-hint.svg</w:t>
+              <w:t>Look near the stairs for the 'What is Forest Park?' label.</w:t>
             </w:r>
           </w:p>
         </w:tc>
@@ -1968,35 +1628,9 @@
           </w:tcPr>
           <w:p>
             <w:r>
-              <w:t>[multiple choice] The famous Mexican grey wolf is named what?</w:t>
+              <w:t>[multiple choice] Finish this sentence: Forest Park is a place to...</w:t>
               <w:br/>
-              <w:t>Anna *  ·  Jack  ·  Beverly</w:t>
-            </w:r>
-          </w:p>
-        </w:tc>
-      </w:tr>
-      <w:tr>
-        <w:tc>
-          <w:tcPr>
-            <w:tcW w:type="dxa" w:w="2551"/>
-            <w:shd w:val="clear" w:color="auto" w:fill="EAF1F8"/>
-          </w:tcPr>
-          <w:p>
-            <w:r>
-              <w:rPr>
-                <w:b/>
-              </w:rPr>
-              <w:t xml:space="preserve">  ↳ Camera (optional)</w:t>
-            </w:r>
-          </w:p>
-        </w:tc>
-        <w:tc>
-          <w:tcPr>
-            <w:tcW w:type="dxa" w:w="6803"/>
-          </w:tcPr>
-          <w:p>
-            <w:r>
-              <w:t>Find a wolf somewhere in the museum!  →  Object: timber wolf, white wolf, grey wolf, gray wolf, red wolf</w:t>
+              <w:t>Play *  ·  Sleep  ·  Be bored</w:t>
             </w:r>
           </w:p>
         </w:tc>
@@ -2022,35 +1656,9 @@
           </w:tcPr>
           <w:p>
             <w:r>
-              <w:t>[multiple choice] What kind of animal is Anna, who helped revive her species?</w:t>
+              <w:t>[multiple choice] What year did Richard Hudlin file his landmark case to desegregate St. Louis tennis facilities?</w:t>
               <w:br/>
-              <w:t>Wolf *  ·  Fox  ·  Coyote</w:t>
-            </w:r>
-          </w:p>
-        </w:tc>
-      </w:tr>
-      <w:tr>
-        <w:tc>
-          <w:tcPr>
-            <w:tcW w:type="dxa" w:w="2551"/>
-            <w:shd w:val="clear" w:color="auto" w:fill="EAF1F8"/>
-          </w:tcPr>
-          <w:p>
-            <w:r>
-              <w:rPr>
-                <w:b/>
-              </w:rPr>
-              <w:t xml:space="preserve">  ↳ Camera (optional)</w:t>
-            </w:r>
-          </w:p>
-        </w:tc>
-        <w:tc>
-          <w:tcPr>
-            <w:tcW w:type="dxa" w:w="6803"/>
-          </w:tcPr>
-          <w:p>
-            <w:r>
-              <w:t>Find a plaque that mentions the word "species".  →  Words: species</w:t>
+              <w:t>1968  ·  1920  ·  1945 *</w:t>
             </w:r>
           </w:p>
         </w:tc>
@@ -2076,35 +1684,9 @@
           </w:tcPr>
           <w:p>
             <w:r>
-              <w:t>[type-in] What year was Anna, the species-reviving Mexican grey wolf, born?</w:t>
+              <w:t>[type-in] As of 2025, how many statues are in Forest Park?</w:t>
               <w:br/>
-              <w:t>Answer: 2001</w:t>
-            </w:r>
-          </w:p>
-        </w:tc>
-      </w:tr>
-      <w:tr>
-        <w:tc>
-          <w:tcPr>
-            <w:tcW w:type="dxa" w:w="2551"/>
-            <w:shd w:val="clear" w:color="auto" w:fill="EAF1F8"/>
-          </w:tcPr>
-          <w:p>
-            <w:r>
-              <w:rPr>
-                <w:b/>
-              </w:rPr>
-              <w:t xml:space="preserve">  ↳ Camera (optional)</w:t>
-            </w:r>
-          </w:p>
-        </w:tc>
-        <w:tc>
-          <w:tcPr>
-            <w:tcW w:type="dxa" w:w="6803"/>
-          </w:tcPr>
-          <w:p>
-            <w:r>
-              <w:t>Find the year Anna was born on a plaque.  →  Words: 2001</w:t>
+              <w:t>Answer: 23</w:t>
             </w:r>
           </w:p>
         </w:tc>
@@ -2160,7 +1742,44 @@
         </w:tc>
       </w:tr>
     </w:tbl>
-    <w:p/>
+    <w:p>
+      <w:r>
+        <w:br w:type="page"/>
+      </w:r>
+    </w:p>
+    <w:p>
+      <w:pPr>
+        <w:jc w:val="left"/>
+      </w:pPr>
+      <w:r>
+        <w:rPr>
+          <w:b/>
+          <w:i w:val="0"/>
+          <w:color w:val="1F4E79"/>
+          <w:sz w:val="32"/>
+        </w:rPr>
+        <w:t>Collected</w:t>
+      </w:r>
+    </w:p>
+    <w:p>
+      <w:r>
+        <w:rPr>
+          <w:i/>
+          <w:color w:val="555555"/>
+          <w:sz w:val="20"/>
+        </w:rPr>
+        <w:t>Stories behind objects in the Collected gallery.</w:t>
+      </w:r>
+    </w:p>
+    <w:p>
+      <w:r>
+        <w:rPr>
+          <w:color w:val="555555"/>
+          <w:sz w:val="18"/>
+        </w:rPr>
+        <w:t>Patch awarded: Collected Patch</w:t>
+      </w:r>
+    </w:p>
     <w:tbl>
       <w:tblPr>
         <w:tblStyle w:val="LightGrid-Accent1"/>
@@ -2643,9 +2262,9 @@
           </w:tcPr>
           <w:p>
             <w:r>
-              <w:t>[multiple choice] What is this big old machine used for?</w:t>
+              <w:t>[multiple choice] What did Gustav and Hazel Goetsch use this printing press for?</w:t>
               <w:br/>
-              <w:t>Printing *  ·  Washing clothes  ·  Grinding flour</w:t>
+              <w:t>Books  ·  Newspapers  ·  Art *</w:t>
             </w:r>
           </w:p>
         </w:tc>
@@ -2938,205 +2557,6 @@
               <w:t>[type-in] What was the name of the drink mix that eventually became Pixy Stix?</w:t>
               <w:br/>
               <w:t>Answer: Fruzola (also accepted: Frutzola)</w:t>
-            </w:r>
-          </w:p>
-        </w:tc>
-      </w:tr>
-      <w:tr>
-        <w:tc>
-          <w:tcPr>
-            <w:tcW w:type="dxa" w:w="2551"/>
-            <w:shd w:val="clear" w:color="auto" w:fill="EAF1F8"/>
-          </w:tcPr>
-          <w:p>
-            <w:r>
-              <w:rPr>
-                <w:b/>
-              </w:rPr>
-              <w:t>Approval</w:t>
-            </w:r>
-          </w:p>
-        </w:tc>
-        <w:tc>
-          <w:tcPr>
-            <w:tcW w:type="dxa" w:w="6803"/>
-          </w:tcPr>
-          <w:p>
-            <w:r>
-              <w:t>☐ Approved    ☐ Changes (note below)    ☐ Rejected</w:t>
-            </w:r>
-          </w:p>
-        </w:tc>
-      </w:tr>
-      <w:tr>
-        <w:tc>
-          <w:tcPr>
-            <w:tcW w:type="dxa" w:w="2551"/>
-            <w:shd w:val="clear" w:color="auto" w:fill="EAF1F8"/>
-          </w:tcPr>
-          <w:p>
-            <w:r>
-              <w:rPr>
-                <w:b/>
-              </w:rPr>
-              <w:t>Notes</w:t>
-            </w:r>
-          </w:p>
-        </w:tc>
-        <w:tc>
-          <w:tcPr>
-            <w:tcW w:type="dxa" w:w="6803"/>
-          </w:tcPr>
-          <w:p>
-            <w:r/>
-          </w:p>
-        </w:tc>
-      </w:tr>
-    </w:tbl>
-    <w:p/>
-    <w:tbl>
-      <w:tblPr>
-        <w:tblStyle w:val="LightGrid-Accent1"/>
-        <w:tblW w:type="auto" w:w="0"/>
-        <w:tblLayout w:type="fixed"/>
-        <w:tblLook w:firstColumn="1" w:firstRow="1" w:lastColumn="0" w:lastRow="0" w:noHBand="0" w:noVBand="1" w:val="04A0"/>
-      </w:tblPr>
-      <w:tblGrid>
-        <w:gridCol w:w="4320"/>
-        <w:gridCol w:w="4320"/>
-      </w:tblGrid>
-      <w:tr>
-        <w:tc>
-          <w:tcPr>
-            <w:tcW w:type="dxa" w:w="2551"/>
-            <w:shd w:val="clear" w:color="auto" w:fill="EAF1F8"/>
-          </w:tcPr>
-          <w:p>
-            <w:r>
-              <w:rPr>
-                <w:b/>
-              </w:rPr>
-              <w:t>Topic</w:t>
-            </w:r>
-          </w:p>
-        </w:tc>
-        <w:tc>
-          <w:tcPr>
-            <w:tcW w:type="dxa" w:w="6803"/>
-          </w:tcPr>
-          <w:p>
-            <w:r>
-              <w:t>Build-A-Bear</w:t>
-            </w:r>
-          </w:p>
-        </w:tc>
-      </w:tr>
-      <w:tr>
-        <w:tc>
-          <w:tcPr>
-            <w:tcW w:type="dxa" w:w="2551"/>
-            <w:shd w:val="clear" w:color="auto" w:fill="EAF1F8"/>
-          </w:tcPr>
-          <w:p>
-            <w:r>
-              <w:rPr>
-                <w:b/>
-              </w:rPr>
-              <w:t>Hint</w:t>
-            </w:r>
-          </w:p>
-        </w:tc>
-        <w:tc>
-          <w:tcPr>
-            <w:tcW w:type="dxa" w:w="6803"/>
-          </w:tcPr>
-          <w:p>
-            <w:r>
-              <w:t>Look in the Made in St. Louis gallery.</w:t>
-            </w:r>
-          </w:p>
-        </w:tc>
-      </w:tr>
-      <w:tr>
-        <w:tc>
-          <w:tcPr>
-            <w:tcW w:type="dxa" w:w="2551"/>
-            <w:shd w:val="clear" w:color="auto" w:fill="EAF1F8"/>
-          </w:tcPr>
-          <w:p>
-            <w:r>
-              <w:rPr>
-                <w:b/>
-              </w:rPr>
-              <w:t>Youth</w:t>
-            </w:r>
-          </w:p>
-        </w:tc>
-        <w:tc>
-          <w:tcPr>
-            <w:tcW w:type="dxa" w:w="6803"/>
-          </w:tcPr>
-          <w:p>
-            <w:r>
-              <w:t>[multiple choice] What is the name of the Build-A-Bear teddy bear in the display case?</w:t>
-              <w:br/>
-              <w:t>Bearemy *  ·  Fluffy McFlufferson  ·  Louie</w:t>
-            </w:r>
-          </w:p>
-        </w:tc>
-      </w:tr>
-      <w:tr>
-        <w:tc>
-          <w:tcPr>
-            <w:tcW w:type="dxa" w:w="2551"/>
-            <w:shd w:val="clear" w:color="auto" w:fill="EAF1F8"/>
-          </w:tcPr>
-          <w:p>
-            <w:r>
-              <w:rPr>
-                <w:b/>
-              </w:rPr>
-              <w:t>Teen</w:t>
-            </w:r>
-          </w:p>
-        </w:tc>
-        <w:tc>
-          <w:tcPr>
-            <w:tcW w:type="dxa" w:w="6803"/>
-          </w:tcPr>
-          <w:p>
-            <w:r>
-              <w:t>[multiple choice] Where did Maxine Clark open the first Build-A-Bear store in 1997?</w:t>
-              <w:br/>
-              <w:t>Downtown Kirkwood  ·  Busch Stadium  ·  The St. Louis Galleria *</w:t>
-            </w:r>
-          </w:p>
-        </w:tc>
-      </w:tr>
-      <w:tr>
-        <w:tc>
-          <w:tcPr>
-            <w:tcW w:type="dxa" w:w="2551"/>
-            <w:shd w:val="clear" w:color="auto" w:fill="EAF1F8"/>
-          </w:tcPr>
-          <w:p>
-            <w:r>
-              <w:rPr>
-                <w:b/>
-              </w:rPr>
-              <w:t>Adult</w:t>
-            </w:r>
-          </w:p>
-        </w:tc>
-        <w:tc>
-          <w:tcPr>
-            <w:tcW w:type="dxa" w:w="6803"/>
-          </w:tcPr>
-          <w:p>
-            <w:r>
-              <w:t>[type-in] How many Build-A-Bear stores operate around the world today?</w:t>
-              <w:br/>
-              <w:t>Answer: 500 (also accepted: 500 stores, around 500, about 500)</w:t>
             </w:r>
           </w:p>
         </w:tc>

</xml_diff>

<commit_message>
content: accept "Cy Avery"; name Ria Unson in Young Spartan question
Team feedback:
- Route 66 adult: accept "Cy Avery" / "Cy" (he's called both Cy and Cyrus)
- World's Fair legacies adult: name the painter (Ria Unson) in the prompt
Also teach the approvals-doc generator the new image scan kind.

Co-Authored-By: Claude Opus 4.8 (1M context) <noreply@anthropic.com>
</commit_message>
<xml_diff>
--- a/docs/Question_Approvals.docx
+++ b/docs/Question_Approvals.docx
@@ -40,7 +40,7 @@
           <w:color w:val="555555"/>
           <w:sz w:val="20"/>
         </w:rPr>
-        <w:t>Generated 2026-07-20</w:t>
+        <w:t>Generated 2026-07-22</w:t>
       </w:r>
     </w:p>
     <w:p/>
@@ -589,7 +589,7 @@
           </w:tcPr>
           <w:p>
             <w:r>
-              <w:t>[type-in] What was the name of Young Spartan painter's great-grandfather who was a waiter and guide at the fair?</w:t>
+              <w:t>[type-in] What was the name of Young Spartan painter Ria Unson's great-grandfather, who was a waiter and guide at the fair?</w:t>
               <w:br/>
               <w:t>Answer: Ramon Ochoa (also accepted: Ochoa, Ramón Ochoa)</w:t>
             </w:r>
@@ -735,6 +735,32 @@
               <w:t>[multiple choice] Name an animal that people might see for the first time at the fair.</w:t>
               <w:br/>
               <w:t>Camel *  ·  Dog  ·  Bird</w:t>
+            </w:r>
+          </w:p>
+        </w:tc>
+      </w:tr>
+      <w:tr>
+        <w:tc>
+          <w:tcPr>
+            <w:tcW w:type="dxa" w:w="2551"/>
+            <w:shd w:val="clear" w:color="auto" w:fill="EAF1F8"/>
+          </w:tcPr>
+          <w:p>
+            <w:r>
+              <w:rPr>
+                <w:b/>
+              </w:rPr>
+              <w:t xml:space="preserve">  ↳ Camera (optional)</w:t>
+            </w:r>
+          </w:p>
+        </w:tc>
+        <w:tc>
+          <w:tcPr>
+            <w:tcW w:type="dxa" w:w="6803"/>
+          </w:tcPr>
+          <w:p>
+            <w:r>
+              <w:t>Find the man riding a camel — point your camera at the camel!  →  Object: camel, Arabian camel, dromedary</w:t>
             </w:r>
           </w:p>
         </w:tc>
@@ -971,6 +997,32 @@
               <w:t>[multiple choice] The cars on the Ferris wheel were as big as a...</w:t>
               <w:br/>
               <w:t>School bus *  ·  Airplane  ·  Swimming pool</w:t>
+            </w:r>
+          </w:p>
+        </w:tc>
+      </w:tr>
+      <w:tr>
+        <w:tc>
+          <w:tcPr>
+            <w:tcW w:type="dxa" w:w="2551"/>
+            <w:shd w:val="clear" w:color="auto" w:fill="EAF1F8"/>
+          </w:tcPr>
+          <w:p>
+            <w:r>
+              <w:rPr>
+                <w:b/>
+              </w:rPr>
+              <w:t xml:space="preserve">  ↳ Camera (optional)</w:t>
+            </w:r>
+          </w:p>
+        </w:tc>
+        <w:tc>
+          <w:tcPr>
+            <w:tcW w:type="dxa" w:w="6803"/>
+          </w:tcPr>
+          <w:p>
+            <w:r>
+              <w:t>Point your camera at the replica Ferris wheel car!  →  Object: school bus, minibus, trolleybus</w:t>
             </w:r>
           </w:p>
         </w:tc>
@@ -2792,7 +2844,7 @@
             <w:r>
               <w:t>[type-in] Who decided to call it "Route 66"?</w:t>
               <w:br/>
-              <w:t>Answer: Cyrus Avery (also accepted: Avery)</w:t>
+              <w:t>Answer: Cyrus Avery (also accepted: Avery, Cy Avery, Cy)</w:t>
             </w:r>
           </w:p>
         </w:tc>
@@ -3885,7 +3937,7 @@
           </w:tcPr>
           <w:p>
             <w:r>
-              <w:t>Scan the STLGameDev logo!  →  Words: GAMEDEV, GAME DEV, STLGAMEDEV, STL</w:t>
+              <w:t>Scan the STLGameDev logo!  →  Image match: images/stlgamedev-logo.png</w:t>
             </w:r>
           </w:p>
         </w:tc>

</xml_diff>

<commit_message>
content: add image-match scans for movie poster, Young Spartan, George Ferris
Wire the three flat, head-on 2D items from the museum team's reference
photos as image-match scans (the sweet spot for MobileNet matching):
- World's Fair / Legacies teen -> "Meet Me in St. Louis" poster
- World's Fair / Legacies adult -> "Young Spartan" painting
- Marvel in Motion / Ferris teen -> George Ferris portrait

Reference images cropped + downscaled from the provided photos.
Thresholds (0.6) are placeholders to calibrate on a phone.

Co-Authored-By: Claude Opus 4.8 (1M context) <noreply@anthropic.com>
</commit_message>
<xml_diff>
--- a/docs/Question_Approvals.docx
+++ b/docs/Question_Approvals.docx
@@ -579,6 +579,32 @@
               <w:rPr>
                 <w:b/>
               </w:rPr>
+              <w:t xml:space="preserve">  ↳ Camera (optional)</w:t>
+            </w:r>
+          </w:p>
+        </w:tc>
+        <w:tc>
+          <w:tcPr>
+            <w:tcW w:type="dxa" w:w="6803"/>
+          </w:tcPr>
+          <w:p>
+            <w:r>
+              <w:t>Find the "Meet Me in St. Louis" movie poster!  →  Image match: images/movie-poster.jpg</w:t>
+            </w:r>
+          </w:p>
+        </w:tc>
+      </w:tr>
+      <w:tr>
+        <w:tc>
+          <w:tcPr>
+            <w:tcW w:type="dxa" w:w="2551"/>
+            <w:shd w:val="clear" w:color="auto" w:fill="EAF1F8"/>
+          </w:tcPr>
+          <w:p>
+            <w:r>
+              <w:rPr>
+                <w:b/>
+              </w:rPr>
               <w:t>Adult</w:t>
             </w:r>
           </w:p>
@@ -592,6 +618,32 @@
               <w:t>[type-in] What was the name of Young Spartan painter Ria Unson's great-grandfather, who was a waiter and guide at the fair?</w:t>
               <w:br/>
               <w:t>Answer: Ramon Ochoa (also accepted: Ochoa, Ramón Ochoa)</w:t>
+            </w:r>
+          </w:p>
+        </w:tc>
+      </w:tr>
+      <w:tr>
+        <w:tc>
+          <w:tcPr>
+            <w:tcW w:type="dxa" w:w="2551"/>
+            <w:shd w:val="clear" w:color="auto" w:fill="EAF1F8"/>
+          </w:tcPr>
+          <w:p>
+            <w:r>
+              <w:rPr>
+                <w:b/>
+              </w:rPr>
+              <w:t xml:space="preserve">  ↳ Camera (optional)</w:t>
+            </w:r>
+          </w:p>
+        </w:tc>
+        <w:tc>
+          <w:tcPr>
+            <w:tcW w:type="dxa" w:w="6803"/>
+          </w:tcPr>
+          <w:p>
+            <w:r>
+              <w:t>Find the "Young Spartan" painting!  →  Image match: images/young-spartan.jpg</w:t>
             </w:r>
           </w:p>
         </w:tc>
@@ -1051,6 +1103,32 @@
               <w:t>[multiple choice] What is the name of the man who invented the Ferris wheel?</w:t>
               <w:br/>
               <w:t>John Jacob Ferris  ·  George Washington Ferris *  ·  Cooper Collin Ferris</w:t>
+            </w:r>
+          </w:p>
+        </w:tc>
+      </w:tr>
+      <w:tr>
+        <w:tc>
+          <w:tcPr>
+            <w:tcW w:type="dxa" w:w="2551"/>
+            <w:shd w:val="clear" w:color="auto" w:fill="EAF1F8"/>
+          </w:tcPr>
+          <w:p>
+            <w:r>
+              <w:rPr>
+                <w:b/>
+              </w:rPr>
+              <w:t xml:space="preserve">  ↳ Camera (optional)</w:t>
+            </w:r>
+          </w:p>
+        </w:tc>
+        <w:tc>
+          <w:tcPr>
+            <w:tcW w:type="dxa" w:w="6803"/>
+          </w:tcPr>
+          <w:p>
+            <w:r>
+              <w:t>Find the photo of George Ferris!  →  Image match: images/george-ferris.jpg</w:t>
             </w:r>
           </w:p>
         </w:tc>

</xml_diff>

<commit_message>
content: add hint images + OCR camera scans across sections
- Switch the movie-poster scan to OCR (more reliable than image match).
- Add OCR camera scans to Route 66, St. Louis Sound, and Made in St. Louis
  (every tier) using text confirmed present in the team's exhibit photos
  (Ted Drewes / 8 states / Cy Avery; Miles Davis / Josephine Baker / Tina
  Turner; 7Up / Reddi-Wip / Pixy Stix).
- Wire 11 hint images from the provided photos (lion's head, push chair,
  Ferris model, Forest Park labels, iron lung, sledge, printing press,
  Reddi-Wip, Route 66 logo).

Regenerated approvals doc.

Co-Authored-By: Claude Opus 4.8 (1M context) <noreply@anthropic.com>
</commit_message>
<xml_diff>
--- a/docs/Question_Approvals.docx
+++ b/docs/Question_Approvals.docx
@@ -272,6 +272,32 @@
               <w:rPr>
                 <w:b/>
               </w:rPr>
+              <w:t>Hint image</w:t>
+            </w:r>
+          </w:p>
+        </w:tc>
+        <w:tc>
+          <w:tcPr>
+            <w:tcW w:type="dxa" w:w="6803"/>
+          </w:tcPr>
+          <w:p>
+            <w:r>
+              <w:t>images/lion-head.jpg</w:t>
+            </w:r>
+          </w:p>
+        </w:tc>
+      </w:tr>
+      <w:tr>
+        <w:tc>
+          <w:tcPr>
+            <w:tcW w:type="dxa" w:w="2551"/>
+            <w:shd w:val="clear" w:color="auto" w:fill="EAF1F8"/>
+          </w:tcPr>
+          <w:p>
+            <w:r>
+              <w:rPr>
+                <w:b/>
+              </w:rPr>
               <w:t>Youth</w:t>
             </w:r>
           </w:p>
@@ -589,7 +615,7 @@
           </w:tcPr>
           <w:p>
             <w:r>
-              <w:t>Find the "Meet Me in St. Louis" movie poster!  →  Image match: images/movie-poster.jpg</w:t>
+              <w:t>Find the "Meet Me in St. Louis" movie poster!  →  Words: Meet Me in St. Louis, MEET ME IN ST, Judy Garland, Technicolor</w:t>
             </w:r>
           </w:p>
         </w:tc>
@@ -759,6 +785,32 @@
           <w:p>
             <w:r>
               <w:t>Look for an interesting way to get around — like the push chair.</w:t>
+            </w:r>
+          </w:p>
+        </w:tc>
+      </w:tr>
+      <w:tr>
+        <w:tc>
+          <w:tcPr>
+            <w:tcW w:type="dxa" w:w="2551"/>
+            <w:shd w:val="clear" w:color="auto" w:fill="EAF1F8"/>
+          </w:tcPr>
+          <w:p>
+            <w:r>
+              <w:rPr>
+                <w:b/>
+              </w:rPr>
+              <w:t>Hint image</w:t>
+            </w:r>
+          </w:p>
+        </w:tc>
+        <w:tc>
+          <w:tcPr>
+            <w:tcW w:type="dxa" w:w="6803"/>
+          </w:tcPr>
+          <w:p>
+            <w:r>
+              <w:t>images/push-chair.jpg</w:t>
             </w:r>
           </w:p>
         </w:tc>
@@ -1036,6 +1088,32 @@
               <w:rPr>
                 <w:b/>
               </w:rPr>
+              <w:t>Hint image</w:t>
+            </w:r>
+          </w:p>
+        </w:tc>
+        <w:tc>
+          <w:tcPr>
+            <w:tcW w:type="dxa" w:w="6803"/>
+          </w:tcPr>
+          <w:p>
+            <w:r>
+              <w:t>images/ferris-model.jpg</w:t>
+            </w:r>
+          </w:p>
+        </w:tc>
+      </w:tr>
+      <w:tr>
+        <w:tc>
+          <w:tcPr>
+            <w:tcW w:type="dxa" w:w="2551"/>
+            <w:shd w:val="clear" w:color="auto" w:fill="EAF1F8"/>
+          </w:tcPr>
+          <w:p>
+            <w:r>
+              <w:rPr>
+                <w:b/>
+              </w:rPr>
               <w:t>Youth</w:t>
             </w:r>
           </w:p>
@@ -1350,6 +1428,32 @@
               <w:rPr>
                 <w:b/>
               </w:rPr>
+              <w:t>Hint image</w:t>
+            </w:r>
+          </w:p>
+        </w:tc>
+        <w:tc>
+          <w:tcPr>
+            <w:tcW w:type="dxa" w:w="6803"/>
+          </w:tcPr>
+          <w:p>
+            <w:r>
+              <w:t>images/history-of-park.jpg</w:t>
+            </w:r>
+          </w:p>
+        </w:tc>
+      </w:tr>
+      <w:tr>
+        <w:tc>
+          <w:tcPr>
+            <w:tcW w:type="dxa" w:w="2551"/>
+            <w:shd w:val="clear" w:color="auto" w:fill="EAF1F8"/>
+          </w:tcPr>
+          <w:p>
+            <w:r>
+              <w:rPr>
+                <w:b/>
+              </w:rPr>
               <w:t>Youth</w:t>
             </w:r>
           </w:p>
@@ -1549,6 +1653,32 @@
               <w:rPr>
                 <w:b/>
               </w:rPr>
+              <w:t>Hint image</w:t>
+            </w:r>
+          </w:p>
+        </w:tc>
+        <w:tc>
+          <w:tcPr>
+            <w:tcW w:type="dxa" w:w="6803"/>
+          </w:tcPr>
+          <w:p>
+            <w:r>
+              <w:t>images/i-love-stl.jpg</w:t>
+            </w:r>
+          </w:p>
+        </w:tc>
+      </w:tr>
+      <w:tr>
+        <w:tc>
+          <w:tcPr>
+            <w:tcW w:type="dxa" w:w="2551"/>
+            <w:shd w:val="clear" w:color="auto" w:fill="EAF1F8"/>
+          </w:tcPr>
+          <w:p>
+            <w:r>
+              <w:rPr>
+                <w:b/>
+              </w:rPr>
               <w:t>Youth</w:t>
             </w:r>
           </w:p>
@@ -1733,6 +1863,32 @@
           <w:p>
             <w:r>
               <w:t>Look near the stairs for the 'What is Forest Park?' label.</w:t>
+            </w:r>
+          </w:p>
+        </w:tc>
+      </w:tr>
+      <w:tr>
+        <w:tc>
+          <w:tcPr>
+            <w:tcW w:type="dxa" w:w="2551"/>
+            <w:shd w:val="clear" w:color="auto" w:fill="EAF1F8"/>
+          </w:tcPr>
+          <w:p>
+            <w:r>
+              <w:rPr>
+                <w:b/>
+              </w:rPr>
+              <w:t>Hint image</w:t>
+            </w:r>
+          </w:p>
+        </w:tc>
+        <w:tc>
+          <w:tcPr>
+            <w:tcW w:type="dxa" w:w="6803"/>
+          </w:tcPr>
+          <w:p>
+            <w:r>
+              <w:t>images/what-is-forest-park.jpg</w:t>
             </w:r>
           </w:p>
         </w:tc>
@@ -1984,6 +2140,32 @@
               <w:rPr>
                 <w:b/>
               </w:rPr>
+              <w:t>Hint image</w:t>
+            </w:r>
+          </w:p>
+        </w:tc>
+        <w:tc>
+          <w:tcPr>
+            <w:tcW w:type="dxa" w:w="6803"/>
+          </w:tcPr>
+          <w:p>
+            <w:r>
+              <w:t>images/iron-lung.jpg</w:t>
+            </w:r>
+          </w:p>
+        </w:tc>
+      </w:tr>
+      <w:tr>
+        <w:tc>
+          <w:tcPr>
+            <w:tcW w:type="dxa" w:w="2551"/>
+            <w:shd w:val="clear" w:color="auto" w:fill="EAF1F8"/>
+          </w:tcPr>
+          <w:p>
+            <w:r>
+              <w:rPr>
+                <w:b/>
+              </w:rPr>
               <w:t>Youth</w:t>
             </w:r>
           </w:p>
@@ -2183,6 +2365,32 @@
               <w:rPr>
                 <w:b/>
               </w:rPr>
+              <w:t>Hint image</w:t>
+            </w:r>
+          </w:p>
+        </w:tc>
+        <w:tc>
+          <w:tcPr>
+            <w:tcW w:type="dxa" w:w="6803"/>
+          </w:tcPr>
+          <w:p>
+            <w:r>
+              <w:t>images/sledge.jpg</w:t>
+            </w:r>
+          </w:p>
+        </w:tc>
+      </w:tr>
+      <w:tr>
+        <w:tc>
+          <w:tcPr>
+            <w:tcW w:type="dxa" w:w="2551"/>
+            <w:shd w:val="clear" w:color="auto" w:fill="EAF1F8"/>
+          </w:tcPr>
+          <w:p>
+            <w:r>
+              <w:rPr>
+                <w:b/>
+              </w:rPr>
               <w:t>Youth</w:t>
             </w:r>
           </w:p>
@@ -2367,6 +2575,32 @@
           <w:p>
             <w:r>
               <w:t>Look for the large spokes of the printing press in the Collected gallery.</w:t>
+            </w:r>
+          </w:p>
+        </w:tc>
+      </w:tr>
+      <w:tr>
+        <w:tc>
+          <w:tcPr>
+            <w:tcW w:type="dxa" w:w="2551"/>
+            <w:shd w:val="clear" w:color="auto" w:fill="EAF1F8"/>
+          </w:tcPr>
+          <w:p>
+            <w:r>
+              <w:rPr>
+                <w:b/>
+              </w:rPr>
+              <w:t>Hint image</w:t>
+            </w:r>
+          </w:p>
+        </w:tc>
+        <w:tc>
+          <w:tcPr>
+            <w:tcW w:type="dxa" w:w="6803"/>
+          </w:tcPr>
+          <w:p>
+            <w:r>
+              <w:t>images/printing-press.jpg</w:t>
             </w:r>
           </w:p>
         </w:tc>
@@ -2618,6 +2852,32 @@
               <w:rPr>
                 <w:b/>
               </w:rPr>
+              <w:t>Hint image</w:t>
+            </w:r>
+          </w:p>
+        </w:tc>
+        <w:tc>
+          <w:tcPr>
+            <w:tcW w:type="dxa" w:w="6803"/>
+          </w:tcPr>
+          <w:p>
+            <w:r>
+              <w:t>images/reddi-wip.jpg</w:t>
+            </w:r>
+          </w:p>
+        </w:tc>
+      </w:tr>
+      <w:tr>
+        <w:tc>
+          <w:tcPr>
+            <w:tcW w:type="dxa" w:w="2551"/>
+            <w:shd w:val="clear" w:color="auto" w:fill="EAF1F8"/>
+          </w:tcPr>
+          <w:p>
+            <w:r>
+              <w:rPr>
+                <w:b/>
+              </w:rPr>
               <w:t>Youth</w:t>
             </w:r>
           </w:p>
@@ -2631,6 +2891,32 @@
               <w:t>[multiple choice] What fizzy lemon soda was invented in St. Louis?</w:t>
               <w:br/>
               <w:t>Sprite  ·  Starry  ·  7Up *</w:t>
+            </w:r>
+          </w:p>
+        </w:tc>
+      </w:tr>
+      <w:tr>
+        <w:tc>
+          <w:tcPr>
+            <w:tcW w:type="dxa" w:w="2551"/>
+            <w:shd w:val="clear" w:color="auto" w:fill="EAF1F8"/>
+          </w:tcPr>
+          <w:p>
+            <w:r>
+              <w:rPr>
+                <w:b/>
+              </w:rPr>
+              <w:t xml:space="preserve">  ↳ Camera (optional)</w:t>
+            </w:r>
+          </w:p>
+        </w:tc>
+        <w:tc>
+          <w:tcPr>
+            <w:tcW w:type="dxa" w:w="6803"/>
+          </w:tcPr>
+          <w:p>
+            <w:r>
+              <w:t>Find the 7Up in the exhibit!  →  Words: 7Up, 7 Up, 7UP, Seven Up</w:t>
             </w:r>
           </w:p>
         </w:tc>
@@ -2674,6 +2960,32 @@
               <w:rPr>
                 <w:b/>
               </w:rPr>
+              <w:t xml:space="preserve">  ↳ Camera (optional)</w:t>
+            </w:r>
+          </w:p>
+        </w:tc>
+        <w:tc>
+          <w:tcPr>
+            <w:tcW w:type="dxa" w:w="6803"/>
+          </w:tcPr>
+          <w:p>
+            <w:r>
+              <w:t>Find the Reddi-Wip in the exhibit!  →  Words: Reddi-Wip, Reddi Wip, Reddiwip, Reddi</w:t>
+            </w:r>
+          </w:p>
+        </w:tc>
+      </w:tr>
+      <w:tr>
+        <w:tc>
+          <w:tcPr>
+            <w:tcW w:type="dxa" w:w="2551"/>
+            <w:shd w:val="clear" w:color="auto" w:fill="EAF1F8"/>
+          </w:tcPr>
+          <w:p>
+            <w:r>
+              <w:rPr>
+                <w:b/>
+              </w:rPr>
               <w:t>Adult</w:t>
             </w:r>
           </w:p>
@@ -2687,6 +2999,32 @@
               <w:t>[type-in] What was the name of the drink mix that eventually became Pixy Stix?</w:t>
               <w:br/>
               <w:t>Answer: Fruzola (also accepted: Frutzola)</w:t>
+            </w:r>
+          </w:p>
+        </w:tc>
+      </w:tr>
+      <w:tr>
+        <w:tc>
+          <w:tcPr>
+            <w:tcW w:type="dxa" w:w="2551"/>
+            <w:shd w:val="clear" w:color="auto" w:fill="EAF1F8"/>
+          </w:tcPr>
+          <w:p>
+            <w:r>
+              <w:rPr>
+                <w:b/>
+              </w:rPr>
+              <w:t xml:space="preserve">  ↳ Camera (optional)</w:t>
+            </w:r>
+          </w:p>
+        </w:tc>
+        <w:tc>
+          <w:tcPr>
+            <w:tcW w:type="dxa" w:w="6803"/>
+          </w:tcPr>
+          <w:p>
+            <w:r>
+              <w:t>Find the label about SweeTarts &amp; Pixy Stix.  →  Words: Fruzola, Pixy Stix, SweeTarts, Sunline</w:t>
             </w:r>
           </w:p>
         </w:tc>
@@ -2854,6 +3192,32 @@
               <w:rPr>
                 <w:b/>
               </w:rPr>
+              <w:t>Hint image</w:t>
+            </w:r>
+          </w:p>
+        </w:tc>
+        <w:tc>
+          <w:tcPr>
+            <w:tcW w:type="dxa" w:w="6803"/>
+          </w:tcPr>
+          <w:p>
+            <w:r>
+              <w:t>images/route-66-logo.jpg</w:t>
+            </w:r>
+          </w:p>
+        </w:tc>
+      </w:tr>
+      <w:tr>
+        <w:tc>
+          <w:tcPr>
+            <w:tcW w:type="dxa" w:w="2551"/>
+            <w:shd w:val="clear" w:color="auto" w:fill="EAF1F8"/>
+          </w:tcPr>
+          <w:p>
+            <w:r>
+              <w:rPr>
+                <w:b/>
+              </w:rPr>
               <w:t>Youth</w:t>
             </w:r>
           </w:p>
@@ -2867,6 +3231,32 @@
               <w:t>[multiple choice] What is the name of the iconic ice cream place on Route 66?</w:t>
               <w:br/>
               <w:t>Ted Drewes *  ·  Arnold's  ·  McFrosty</w:t>
+            </w:r>
+          </w:p>
+        </w:tc>
+      </w:tr>
+      <w:tr>
+        <w:tc>
+          <w:tcPr>
+            <w:tcW w:type="dxa" w:w="2551"/>
+            <w:shd w:val="clear" w:color="auto" w:fill="EAF1F8"/>
+          </w:tcPr>
+          <w:p>
+            <w:r>
+              <w:rPr>
+                <w:b/>
+              </w:rPr>
+              <w:t xml:space="preserve">  ↳ Camera (optional)</w:t>
+            </w:r>
+          </w:p>
+        </w:tc>
+        <w:tc>
+          <w:tcPr>
+            <w:tcW w:type="dxa" w:w="6803"/>
+          </w:tcPr>
+          <w:p>
+            <w:r>
+              <w:t>Find the Ted Drewes sign!  →  Words: Ted Drewes, Ted Drews, Drewes, Frozen Custard</w:t>
             </w:r>
           </w:p>
         </w:tc>
@@ -2910,6 +3300,32 @@
               <w:rPr>
                 <w:b/>
               </w:rPr>
+              <w:t xml:space="preserve">  ↳ Camera (optional)</w:t>
+            </w:r>
+          </w:p>
+        </w:tc>
+        <w:tc>
+          <w:tcPr>
+            <w:tcW w:type="dxa" w:w="6803"/>
+          </w:tcPr>
+          <w:p>
+            <w:r>
+              <w:t>Find the Route 66 panel that lists the states it crosses.  →  Words: 8 states, eight states, 100 cities, Chicago to Los Angeles</w:t>
+            </w:r>
+          </w:p>
+        </w:tc>
+      </w:tr>
+      <w:tr>
+        <w:tc>
+          <w:tcPr>
+            <w:tcW w:type="dxa" w:w="2551"/>
+            <w:shd w:val="clear" w:color="auto" w:fill="EAF1F8"/>
+          </w:tcPr>
+          <w:p>
+            <w:r>
+              <w:rPr>
+                <w:b/>
+              </w:rPr>
               <w:t>Adult</w:t>
             </w:r>
           </w:p>
@@ -2923,6 +3339,32 @@
               <w:t>[type-in] Who decided to call it "Route 66"?</w:t>
               <w:br/>
               <w:t>Answer: Cyrus Avery (also accepted: Avery, Cy Avery, Cy)</w:t>
+            </w:r>
+          </w:p>
+        </w:tc>
+      </w:tr>
+      <w:tr>
+        <w:tc>
+          <w:tcPr>
+            <w:tcW w:type="dxa" w:w="2551"/>
+            <w:shd w:val="clear" w:color="auto" w:fill="EAF1F8"/>
+          </w:tcPr>
+          <w:p>
+            <w:r>
+              <w:rPr>
+                <w:b/>
+              </w:rPr>
+              <w:t xml:space="preserve">  ↳ Camera (optional)</w:t>
+            </w:r>
+          </w:p>
+        </w:tc>
+        <w:tc>
+          <w:tcPr>
+            <w:tcW w:type="dxa" w:w="6803"/>
+          </w:tcPr>
+          <w:p>
+            <w:r>
+              <w:t>Find the plaque about the "Father of Route 66".  →  Words: Cyrus Avery, Cy Avery, Father of Route 66, Avery</w:t>
             </w:r>
           </w:p>
         </w:tc>
@@ -3074,7 +3516,7 @@
           </w:tcPr>
           <w:p>
             <w:r>
-              <w:t>Do you hear that sound? Look for the St. Louis Sound logo.</w:t>
+              <w:t>Do you hear that sound? Look for the St. Louis Sound murals.</w:t>
             </w:r>
           </w:p>
         </w:tc>
@@ -3118,6 +3560,32 @@
               <w:rPr>
                 <w:b/>
               </w:rPr>
+              <w:t xml:space="preserve">  ↳ Camera (optional)</w:t>
+            </w:r>
+          </w:p>
+        </w:tc>
+        <w:tc>
+          <w:tcPr>
+            <w:tcW w:type="dxa" w:w="6803"/>
+          </w:tcPr>
+          <w:p>
+            <w:r>
+              <w:t>Find the Miles Davis mural!  →  Words: Miles Davis, MILES DAVIS, Davis</w:t>
+            </w:r>
+          </w:p>
+        </w:tc>
+      </w:tr>
+      <w:tr>
+        <w:tc>
+          <w:tcPr>
+            <w:tcW w:type="dxa" w:w="2551"/>
+            <w:shd w:val="clear" w:color="auto" w:fill="EAF1F8"/>
+          </w:tcPr>
+          <w:p>
+            <w:r>
+              <w:rPr>
+                <w:b/>
+              </w:rPr>
               <w:t>Teen</w:t>
             </w:r>
           </w:p>
@@ -3131,6 +3599,32 @@
               <w:t>[multiple choice] Where was the famous dancer, singer, and resistance fighter Josephine Baker born?</w:t>
               <w:br/>
               <w:t>Chesterfield  ·  South City  ·  Mill Creek Valley *</w:t>
+            </w:r>
+          </w:p>
+        </w:tc>
+      </w:tr>
+      <w:tr>
+        <w:tc>
+          <w:tcPr>
+            <w:tcW w:type="dxa" w:w="2551"/>
+            <w:shd w:val="clear" w:color="auto" w:fill="EAF1F8"/>
+          </w:tcPr>
+          <w:p>
+            <w:r>
+              <w:rPr>
+                <w:b/>
+              </w:rPr>
+              <w:t xml:space="preserve">  ↳ Camera (optional)</w:t>
+            </w:r>
+          </w:p>
+        </w:tc>
+        <w:tc>
+          <w:tcPr>
+            <w:tcW w:type="dxa" w:w="6803"/>
+          </w:tcPr>
+          <w:p>
+            <w:r>
+              <w:t>Find the Josephine Baker mural!  →  Words: Josephine Baker, JOSEPHINE BAKER, Baker</w:t>
             </w:r>
           </w:p>
         </w:tc>
@@ -3159,6 +3653,32 @@
               <w:t>[type-in] Which St. Louis R&amp;B legend was born Anna Mae Bullock?</w:t>
               <w:br/>
               <w:t>Answer: Tina Turner (also accepted: Tina)</w:t>
+            </w:r>
+          </w:p>
+        </w:tc>
+      </w:tr>
+      <w:tr>
+        <w:tc>
+          <w:tcPr>
+            <w:tcW w:type="dxa" w:w="2551"/>
+            <w:shd w:val="clear" w:color="auto" w:fill="EAF1F8"/>
+          </w:tcPr>
+          <w:p>
+            <w:r>
+              <w:rPr>
+                <w:b/>
+              </w:rPr>
+              <w:t xml:space="preserve">  ↳ Camera (optional)</w:t>
+            </w:r>
+          </w:p>
+        </w:tc>
+        <w:tc>
+          <w:tcPr>
+            <w:tcW w:type="dxa" w:w="6803"/>
+          </w:tcPr>
+          <w:p>
+            <w:r>
+              <w:t>Find the Tina Turner display!  →  Words: Tina Turner, TINA TURNER, Anna Mae Bullock</w:t>
             </w:r>
           </w:p>
         </w:tc>

</xml_diff>